<commit_message>
Update 1.5 Guia Estudiante with revised project definition document
</commit_message>
<xml_diff>
--- a/Fase_1/Evidencias Grupales/1.5_GuiaEstudiante_Fase 1_Definicion Proyecto APT.docx
+++ b/Fase_1/Evidencias Grupales/1.5_GuiaEstudiante_Fase 1_Definicion Proyecto APT.docx
@@ -6791,26 +6791,26 @@
         <w:tblLook w:val="04A0" w:firstRow="1" w:lastRow="0" w:firstColumn="1" w:lastColumn="0" w:noHBand="0" w:noVBand="1"/>
       </w:tblPr>
       <w:tblGrid>
-        <w:gridCol w:w="1351"/>
-        <w:gridCol w:w="536"/>
-        <w:gridCol w:w="522"/>
-        <w:gridCol w:w="523"/>
-        <w:gridCol w:w="526"/>
-        <w:gridCol w:w="523"/>
-        <w:gridCol w:w="523"/>
-        <w:gridCol w:w="523"/>
-        <w:gridCol w:w="523"/>
-        <w:gridCol w:w="523"/>
-        <w:gridCol w:w="523"/>
-        <w:gridCol w:w="523"/>
-        <w:gridCol w:w="523"/>
-        <w:gridCol w:w="525"/>
-        <w:gridCol w:w="525"/>
-        <w:gridCol w:w="525"/>
+        <w:gridCol w:w="1609"/>
+        <w:gridCol w:w="518"/>
+        <w:gridCol w:w="506"/>
+        <w:gridCol w:w="507"/>
+        <w:gridCol w:w="510"/>
+        <w:gridCol w:w="508"/>
+        <w:gridCol w:w="508"/>
+        <w:gridCol w:w="508"/>
+        <w:gridCol w:w="508"/>
+        <w:gridCol w:w="508"/>
+        <w:gridCol w:w="510"/>
+        <w:gridCol w:w="510"/>
+        <w:gridCol w:w="510"/>
+        <w:gridCol w:w="512"/>
+        <w:gridCol w:w="512"/>
+        <w:gridCol w:w="512"/>
         <w:gridCol w:w="7"/>
-        <w:gridCol w:w="518"/>
-        <w:gridCol w:w="525"/>
-        <w:gridCol w:w="525"/>
+        <w:gridCol w:w="505"/>
+        <w:gridCol w:w="512"/>
+        <w:gridCol w:w="512"/>
         <w:gridCol w:w="10"/>
       </w:tblGrid>
       <w:tr>
@@ -6819,7 +6819,7 @@
         </w:trPr>
         <w:tc>
           <w:tcPr>
-            <w:tcW w:w="1351" w:type="dxa"/>
+            <w:tcW w:w="1463" w:type="dxa"/>
             <w:vMerge w:val="restart"/>
             <w:hideMark/>
           </w:tcPr>
@@ -6845,7 +6845,7 @@
         </w:tc>
         <w:tc>
           <w:tcPr>
-            <w:tcW w:w="2107" w:type="dxa"/>
+            <w:tcW w:w="2075" w:type="dxa"/>
             <w:gridSpan w:val="4"/>
             <w:shd w:val="clear" w:color="auto" w:fill="E2EFD9" w:themeFill="accent6" w:themeFillTint="33"/>
             <w:hideMark/>
@@ -6872,7 +6872,7 @@
         </w:tc>
         <w:tc>
           <w:tcPr>
-            <w:tcW w:w="5766" w:type="dxa"/>
+            <w:tcW w:w="5701" w:type="dxa"/>
             <w:gridSpan w:val="12"/>
             <w:shd w:val="clear" w:color="auto" w:fill="FFF2CC" w:themeFill="accent4" w:themeFillTint="33"/>
             <w:hideMark/>
@@ -6899,7 +6899,7 @@
         </w:tc>
         <w:tc>
           <w:tcPr>
-            <w:tcW w:w="1578" w:type="dxa"/>
+            <w:tcW w:w="1563" w:type="dxa"/>
             <w:gridSpan w:val="4"/>
             <w:shd w:val="clear" w:color="auto" w:fill="FBE4D5" w:themeFill="accent2" w:themeFillTint="33"/>
             <w:hideMark/>
@@ -6950,7 +6950,7 @@
         </w:tc>
         <w:tc>
           <w:tcPr>
-            <w:tcW w:w="536" w:type="dxa"/>
+            <w:tcW w:w="527" w:type="dxa"/>
             <w:hideMark/>
           </w:tcPr>
           <w:p>
@@ -6975,7 +6975,7 @@
         </w:tc>
         <w:tc>
           <w:tcPr>
-            <w:tcW w:w="522" w:type="dxa"/>
+            <w:tcW w:w="514" w:type="dxa"/>
             <w:hideMark/>
           </w:tcPr>
           <w:p>
@@ -7000,7 +7000,7 @@
         </w:tc>
         <w:tc>
           <w:tcPr>
-            <w:tcW w:w="523" w:type="dxa"/>
+            <w:tcW w:w="515" w:type="dxa"/>
             <w:hideMark/>
           </w:tcPr>
           <w:p>
@@ -7025,7 +7025,7 @@
         </w:tc>
         <w:tc>
           <w:tcPr>
-            <w:tcW w:w="526" w:type="dxa"/>
+            <w:tcW w:w="519" w:type="dxa"/>
             <w:hideMark/>
           </w:tcPr>
           <w:p>
@@ -7050,7 +7050,7 @@
         </w:tc>
         <w:tc>
           <w:tcPr>
-            <w:tcW w:w="523" w:type="dxa"/>
+            <w:tcW w:w="516" w:type="dxa"/>
             <w:hideMark/>
           </w:tcPr>
           <w:p>
@@ -7075,7 +7075,7 @@
         </w:tc>
         <w:tc>
           <w:tcPr>
-            <w:tcW w:w="523" w:type="dxa"/>
+            <w:tcW w:w="516" w:type="dxa"/>
             <w:hideMark/>
           </w:tcPr>
           <w:p>
@@ -7100,7 +7100,7 @@
         </w:tc>
         <w:tc>
           <w:tcPr>
-            <w:tcW w:w="523" w:type="dxa"/>
+            <w:tcW w:w="516" w:type="dxa"/>
             <w:hideMark/>
           </w:tcPr>
           <w:p>
@@ -7125,7 +7125,7 @@
         </w:tc>
         <w:tc>
           <w:tcPr>
-            <w:tcW w:w="523" w:type="dxa"/>
+            <w:tcW w:w="516" w:type="dxa"/>
             <w:hideMark/>
           </w:tcPr>
           <w:p>
@@ -7150,7 +7150,7 @@
         </w:tc>
         <w:tc>
           <w:tcPr>
-            <w:tcW w:w="523" w:type="dxa"/>
+            <w:tcW w:w="516" w:type="dxa"/>
             <w:hideMark/>
           </w:tcPr>
           <w:p>
@@ -7175,7 +7175,7 @@
         </w:tc>
         <w:tc>
           <w:tcPr>
-            <w:tcW w:w="523" w:type="dxa"/>
+            <w:tcW w:w="518" w:type="dxa"/>
             <w:hideMark/>
           </w:tcPr>
           <w:p>
@@ -7200,7 +7200,7 @@
         </w:tc>
         <w:tc>
           <w:tcPr>
-            <w:tcW w:w="523" w:type="dxa"/>
+            <w:tcW w:w="518" w:type="dxa"/>
             <w:hideMark/>
           </w:tcPr>
           <w:p>
@@ -7225,7 +7225,7 @@
         </w:tc>
         <w:tc>
           <w:tcPr>
-            <w:tcW w:w="523" w:type="dxa"/>
+            <w:tcW w:w="518" w:type="dxa"/>
             <w:hideMark/>
           </w:tcPr>
           <w:p>
@@ -7250,7 +7250,7 @@
         </w:tc>
         <w:tc>
           <w:tcPr>
-            <w:tcW w:w="525" w:type="dxa"/>
+            <w:tcW w:w="520" w:type="dxa"/>
             <w:hideMark/>
           </w:tcPr>
           <w:p>
@@ -7275,7 +7275,7 @@
         </w:tc>
         <w:tc>
           <w:tcPr>
-            <w:tcW w:w="525" w:type="dxa"/>
+            <w:tcW w:w="520" w:type="dxa"/>
             <w:hideMark/>
           </w:tcPr>
           <w:p>
@@ -7300,7 +7300,7 @@
         </w:tc>
         <w:tc>
           <w:tcPr>
-            <w:tcW w:w="525" w:type="dxa"/>
+            <w:tcW w:w="520" w:type="dxa"/>
             <w:hideMark/>
           </w:tcPr>
           <w:p>
@@ -7325,7 +7325,7 @@
         </w:tc>
         <w:tc>
           <w:tcPr>
-            <w:tcW w:w="525" w:type="dxa"/>
+            <w:tcW w:w="520" w:type="dxa"/>
             <w:gridSpan w:val="2"/>
             <w:hideMark/>
           </w:tcPr>
@@ -7351,7 +7351,7 @@
         </w:tc>
         <w:tc>
           <w:tcPr>
-            <w:tcW w:w="525" w:type="dxa"/>
+            <w:tcW w:w="520" w:type="dxa"/>
             <w:hideMark/>
           </w:tcPr>
           <w:p>
@@ -7376,7 +7376,7 @@
         </w:tc>
         <w:tc>
           <w:tcPr>
-            <w:tcW w:w="525" w:type="dxa"/>
+            <w:tcW w:w="520" w:type="dxa"/>
             <w:hideMark/>
           </w:tcPr>
           <w:p>
@@ -7408,7 +7408,7 @@
         </w:trPr>
         <w:tc>
           <w:tcPr>
-            <w:tcW w:w="1351" w:type="dxa"/>
+            <w:tcW w:w="1463" w:type="dxa"/>
             <w:hideMark/>
           </w:tcPr>
           <w:p>
@@ -7422,261 +7422,261 @@
               </w:rPr>
             </w:pPr>
             <w:r>
-              <w:rPr>
-                <w:rFonts w:ascii="Calibri" w:hAnsi="Calibri" w:cs="Arial"/>
-                <w:i/>
-                <w:color w:val="548DD4"/>
-                <w:sz w:val="16"/>
-                <w:szCs w:val="16"/>
-                <w:lang w:eastAsia="es-CL"/>
-              </w:rPr>
-              <w:t>Describe actividades del punto anterior</w:t>
-            </w:r>
-          </w:p>
-        </w:tc>
-        <w:tc>
-          <w:tcPr>
-            <w:tcW w:w="536" w:type="dxa"/>
-          </w:tcPr>
-          <w:p>
-            <w:pPr>
-              <w:spacing w:line="360" w:lineRule="auto"/>
-              <w:jc w:val="both"/>
-              <w:rPr>
-                <w:b/>
-                <w:sz w:val="16"/>
-                <w:szCs w:val="16"/>
-              </w:rPr>
-            </w:pPr>
-          </w:p>
-        </w:tc>
-        <w:tc>
-          <w:tcPr>
-            <w:tcW w:w="522" w:type="dxa"/>
-          </w:tcPr>
-          <w:p>
-            <w:pPr>
-              <w:spacing w:line="360" w:lineRule="auto"/>
-              <w:jc w:val="both"/>
-              <w:rPr>
-                <w:b/>
-                <w:sz w:val="16"/>
-                <w:szCs w:val="16"/>
-              </w:rPr>
-            </w:pPr>
-          </w:p>
-        </w:tc>
-        <w:tc>
-          <w:tcPr>
-            <w:tcW w:w="523" w:type="dxa"/>
-          </w:tcPr>
-          <w:p>
-            <w:pPr>
-              <w:spacing w:line="360" w:lineRule="auto"/>
-              <w:jc w:val="both"/>
-              <w:rPr>
-                <w:b/>
-                <w:sz w:val="16"/>
-                <w:szCs w:val="16"/>
-              </w:rPr>
-            </w:pPr>
-          </w:p>
-        </w:tc>
-        <w:tc>
-          <w:tcPr>
-            <w:tcW w:w="526" w:type="dxa"/>
-          </w:tcPr>
-          <w:p>
-            <w:pPr>
-              <w:spacing w:line="360" w:lineRule="auto"/>
-              <w:jc w:val="both"/>
-              <w:rPr>
-                <w:b/>
-                <w:sz w:val="16"/>
-                <w:szCs w:val="16"/>
-              </w:rPr>
-            </w:pPr>
-          </w:p>
-        </w:tc>
-        <w:tc>
-          <w:tcPr>
-            <w:tcW w:w="523" w:type="dxa"/>
-          </w:tcPr>
-          <w:p>
-            <w:pPr>
-              <w:spacing w:line="360" w:lineRule="auto"/>
-              <w:jc w:val="both"/>
-              <w:rPr>
-                <w:b/>
-                <w:sz w:val="16"/>
-                <w:szCs w:val="16"/>
-              </w:rPr>
-            </w:pPr>
-          </w:p>
-        </w:tc>
-        <w:tc>
-          <w:tcPr>
-            <w:tcW w:w="523" w:type="dxa"/>
-          </w:tcPr>
-          <w:p>
-            <w:pPr>
-              <w:spacing w:line="360" w:lineRule="auto"/>
-              <w:jc w:val="both"/>
-              <w:rPr>
-                <w:b/>
-                <w:sz w:val="16"/>
-                <w:szCs w:val="16"/>
-              </w:rPr>
-            </w:pPr>
-          </w:p>
-        </w:tc>
-        <w:tc>
-          <w:tcPr>
-            <w:tcW w:w="523" w:type="dxa"/>
-          </w:tcPr>
-          <w:p>
-            <w:pPr>
-              <w:spacing w:line="360" w:lineRule="auto"/>
-              <w:jc w:val="both"/>
-              <w:rPr>
-                <w:b/>
-                <w:sz w:val="16"/>
-                <w:szCs w:val="16"/>
-              </w:rPr>
-            </w:pPr>
-          </w:p>
-        </w:tc>
-        <w:tc>
-          <w:tcPr>
-            <w:tcW w:w="523" w:type="dxa"/>
-          </w:tcPr>
-          <w:p>
-            <w:pPr>
-              <w:spacing w:line="360" w:lineRule="auto"/>
-              <w:jc w:val="both"/>
-              <w:rPr>
-                <w:b/>
-                <w:sz w:val="16"/>
-                <w:szCs w:val="16"/>
-              </w:rPr>
-            </w:pPr>
-          </w:p>
-        </w:tc>
-        <w:tc>
-          <w:tcPr>
-            <w:tcW w:w="523" w:type="dxa"/>
-          </w:tcPr>
-          <w:p>
-            <w:pPr>
-              <w:spacing w:line="360" w:lineRule="auto"/>
-              <w:jc w:val="both"/>
-              <w:rPr>
-                <w:b/>
-                <w:sz w:val="16"/>
-                <w:szCs w:val="16"/>
-              </w:rPr>
-            </w:pPr>
-          </w:p>
-        </w:tc>
-        <w:tc>
-          <w:tcPr>
-            <w:tcW w:w="523" w:type="dxa"/>
-          </w:tcPr>
-          <w:p>
-            <w:pPr>
-              <w:spacing w:line="360" w:lineRule="auto"/>
-              <w:jc w:val="both"/>
-              <w:rPr>
-                <w:b/>
-                <w:sz w:val="16"/>
-                <w:szCs w:val="16"/>
-              </w:rPr>
-            </w:pPr>
-          </w:p>
-        </w:tc>
-        <w:tc>
-          <w:tcPr>
-            <w:tcW w:w="523" w:type="dxa"/>
-          </w:tcPr>
-          <w:p>
-            <w:pPr>
-              <w:spacing w:line="360" w:lineRule="auto"/>
-              <w:jc w:val="both"/>
-              <w:rPr>
-                <w:b/>
-                <w:sz w:val="16"/>
-                <w:szCs w:val="16"/>
-              </w:rPr>
-            </w:pPr>
-          </w:p>
-        </w:tc>
-        <w:tc>
-          <w:tcPr>
-            <w:tcW w:w="523" w:type="dxa"/>
-          </w:tcPr>
-          <w:p>
-            <w:pPr>
-              <w:spacing w:line="360" w:lineRule="auto"/>
-              <w:jc w:val="both"/>
-              <w:rPr>
-                <w:b/>
-                <w:sz w:val="16"/>
-                <w:szCs w:val="16"/>
-              </w:rPr>
-            </w:pPr>
-          </w:p>
-        </w:tc>
-        <w:tc>
-          <w:tcPr>
-            <w:tcW w:w="525" w:type="dxa"/>
-          </w:tcPr>
-          <w:p>
-            <w:pPr>
-              <w:spacing w:line="360" w:lineRule="auto"/>
-              <w:jc w:val="both"/>
-              <w:rPr>
-                <w:b/>
-                <w:sz w:val="16"/>
-                <w:szCs w:val="16"/>
-              </w:rPr>
-            </w:pPr>
-          </w:p>
-        </w:tc>
-        <w:tc>
-          <w:tcPr>
-            <w:tcW w:w="525" w:type="dxa"/>
-          </w:tcPr>
-          <w:p>
-            <w:pPr>
-              <w:spacing w:line="360" w:lineRule="auto"/>
-              <w:jc w:val="both"/>
-              <w:rPr>
-                <w:b/>
-                <w:sz w:val="16"/>
-                <w:szCs w:val="16"/>
-              </w:rPr>
-            </w:pPr>
-          </w:p>
-        </w:tc>
-        <w:tc>
-          <w:tcPr>
-            <w:tcW w:w="525" w:type="dxa"/>
-          </w:tcPr>
-          <w:p>
-            <w:pPr>
-              <w:spacing w:line="360" w:lineRule="auto"/>
-              <w:jc w:val="both"/>
-              <w:rPr>
-                <w:b/>
-                <w:sz w:val="16"/>
-                <w:szCs w:val="16"/>
-              </w:rPr>
-            </w:pPr>
-          </w:p>
-        </w:tc>
-        <w:tc>
-          <w:tcPr>
-            <w:tcW w:w="525" w:type="dxa"/>
+              <w:t>Visita al taller mecánico</w:t>
+            </w:r>
+          </w:p>
+        </w:tc>
+        <w:tc>
+          <w:tcPr>
+            <w:tcW w:w="527" w:type="dxa"/>
+          </w:tcPr>
+          <w:p>
+            <w:pPr>
+              <w:spacing w:line="360" w:lineRule="auto"/>
+              <w:jc w:val="center"/>
+              <w:rPr>
+                <w:b/>
+                <w:sz w:val="20"/>
+                <w:szCs w:val="20"/>
+              </w:rPr>
+            </w:pPr>
+            <w:r>
+              <w:rPr>
+                <w:b/>
+                <w:sz w:val="20"/>
+                <w:szCs w:val="20"/>
+              </w:rPr>
+              <w:t>X</w:t>
+            </w:r>
+          </w:p>
+        </w:tc>
+        <w:tc>
+          <w:tcPr>
+            <w:tcW w:w="514" w:type="dxa"/>
+          </w:tcPr>
+          <w:p>
+            <w:pPr>
+              <w:spacing w:line="360" w:lineRule="auto"/>
+              <w:jc w:val="both"/>
+              <w:rPr>
+                <w:b/>
+                <w:sz w:val="16"/>
+                <w:szCs w:val="16"/>
+              </w:rPr>
+            </w:pPr>
+          </w:p>
+        </w:tc>
+        <w:tc>
+          <w:tcPr>
+            <w:tcW w:w="515" w:type="dxa"/>
+          </w:tcPr>
+          <w:p>
+            <w:pPr>
+              <w:spacing w:line="360" w:lineRule="auto"/>
+              <w:jc w:val="both"/>
+              <w:rPr>
+                <w:b/>
+                <w:sz w:val="16"/>
+                <w:szCs w:val="16"/>
+              </w:rPr>
+            </w:pPr>
+          </w:p>
+        </w:tc>
+        <w:tc>
+          <w:tcPr>
+            <w:tcW w:w="519" w:type="dxa"/>
+          </w:tcPr>
+          <w:p>
+            <w:pPr>
+              <w:spacing w:line="360" w:lineRule="auto"/>
+              <w:jc w:val="both"/>
+              <w:rPr>
+                <w:b/>
+                <w:sz w:val="16"/>
+                <w:szCs w:val="16"/>
+              </w:rPr>
+            </w:pPr>
+          </w:p>
+        </w:tc>
+        <w:tc>
+          <w:tcPr>
+            <w:tcW w:w="516" w:type="dxa"/>
+          </w:tcPr>
+          <w:p>
+            <w:pPr>
+              <w:spacing w:line="360" w:lineRule="auto"/>
+              <w:jc w:val="both"/>
+              <w:rPr>
+                <w:b/>
+                <w:sz w:val="16"/>
+                <w:szCs w:val="16"/>
+              </w:rPr>
+            </w:pPr>
+          </w:p>
+        </w:tc>
+        <w:tc>
+          <w:tcPr>
+            <w:tcW w:w="516" w:type="dxa"/>
+          </w:tcPr>
+          <w:p>
+            <w:pPr>
+              <w:spacing w:line="360" w:lineRule="auto"/>
+              <w:jc w:val="both"/>
+              <w:rPr>
+                <w:b/>
+                <w:sz w:val="16"/>
+                <w:szCs w:val="16"/>
+              </w:rPr>
+            </w:pPr>
+          </w:p>
+        </w:tc>
+        <w:tc>
+          <w:tcPr>
+            <w:tcW w:w="516" w:type="dxa"/>
+          </w:tcPr>
+          <w:p>
+            <w:pPr>
+              <w:spacing w:line="360" w:lineRule="auto"/>
+              <w:jc w:val="both"/>
+              <w:rPr>
+                <w:b/>
+                <w:sz w:val="16"/>
+                <w:szCs w:val="16"/>
+              </w:rPr>
+            </w:pPr>
+          </w:p>
+        </w:tc>
+        <w:tc>
+          <w:tcPr>
+            <w:tcW w:w="516" w:type="dxa"/>
+          </w:tcPr>
+          <w:p>
+            <w:pPr>
+              <w:spacing w:line="360" w:lineRule="auto"/>
+              <w:jc w:val="both"/>
+              <w:rPr>
+                <w:b/>
+                <w:sz w:val="16"/>
+                <w:szCs w:val="16"/>
+              </w:rPr>
+            </w:pPr>
+          </w:p>
+        </w:tc>
+        <w:tc>
+          <w:tcPr>
+            <w:tcW w:w="516" w:type="dxa"/>
+          </w:tcPr>
+          <w:p>
+            <w:pPr>
+              <w:spacing w:line="360" w:lineRule="auto"/>
+              <w:jc w:val="both"/>
+              <w:rPr>
+                <w:b/>
+                <w:sz w:val="16"/>
+                <w:szCs w:val="16"/>
+              </w:rPr>
+            </w:pPr>
+          </w:p>
+        </w:tc>
+        <w:tc>
+          <w:tcPr>
+            <w:tcW w:w="518" w:type="dxa"/>
+          </w:tcPr>
+          <w:p>
+            <w:pPr>
+              <w:spacing w:line="360" w:lineRule="auto"/>
+              <w:jc w:val="both"/>
+              <w:rPr>
+                <w:b/>
+                <w:sz w:val="16"/>
+                <w:szCs w:val="16"/>
+              </w:rPr>
+            </w:pPr>
+          </w:p>
+        </w:tc>
+        <w:tc>
+          <w:tcPr>
+            <w:tcW w:w="518" w:type="dxa"/>
+          </w:tcPr>
+          <w:p>
+            <w:pPr>
+              <w:spacing w:line="360" w:lineRule="auto"/>
+              <w:jc w:val="both"/>
+              <w:rPr>
+                <w:b/>
+                <w:sz w:val="16"/>
+                <w:szCs w:val="16"/>
+              </w:rPr>
+            </w:pPr>
+          </w:p>
+        </w:tc>
+        <w:tc>
+          <w:tcPr>
+            <w:tcW w:w="518" w:type="dxa"/>
+          </w:tcPr>
+          <w:p>
+            <w:pPr>
+              <w:spacing w:line="360" w:lineRule="auto"/>
+              <w:jc w:val="both"/>
+              <w:rPr>
+                <w:b/>
+                <w:sz w:val="16"/>
+                <w:szCs w:val="16"/>
+              </w:rPr>
+            </w:pPr>
+          </w:p>
+        </w:tc>
+        <w:tc>
+          <w:tcPr>
+            <w:tcW w:w="520" w:type="dxa"/>
+          </w:tcPr>
+          <w:p>
+            <w:pPr>
+              <w:spacing w:line="360" w:lineRule="auto"/>
+              <w:jc w:val="both"/>
+              <w:rPr>
+                <w:b/>
+                <w:sz w:val="16"/>
+                <w:szCs w:val="16"/>
+              </w:rPr>
+            </w:pPr>
+          </w:p>
+        </w:tc>
+        <w:tc>
+          <w:tcPr>
+            <w:tcW w:w="520" w:type="dxa"/>
+          </w:tcPr>
+          <w:p>
+            <w:pPr>
+              <w:spacing w:line="360" w:lineRule="auto"/>
+              <w:jc w:val="both"/>
+              <w:rPr>
+                <w:b/>
+                <w:sz w:val="16"/>
+                <w:szCs w:val="16"/>
+              </w:rPr>
+            </w:pPr>
+          </w:p>
+        </w:tc>
+        <w:tc>
+          <w:tcPr>
+            <w:tcW w:w="520" w:type="dxa"/>
+          </w:tcPr>
+          <w:p>
+            <w:pPr>
+              <w:spacing w:line="360" w:lineRule="auto"/>
+              <w:jc w:val="both"/>
+              <w:rPr>
+                <w:b/>
+                <w:sz w:val="16"/>
+                <w:szCs w:val="16"/>
+              </w:rPr>
+            </w:pPr>
+          </w:p>
+        </w:tc>
+        <w:tc>
+          <w:tcPr>
+            <w:tcW w:w="520" w:type="dxa"/>
             <w:gridSpan w:val="2"/>
           </w:tcPr>
           <w:p>
@@ -7693,23 +7693,23 @@
         </w:tc>
         <w:tc>
           <w:tcPr>
-            <w:tcW w:w="525" w:type="dxa"/>
-          </w:tcPr>
-          <w:p>
-            <w:pPr>
-              <w:spacing w:line="360" w:lineRule="auto"/>
-              <w:jc w:val="both"/>
-              <w:rPr>
-                <w:b/>
-                <w:sz w:val="16"/>
-                <w:szCs w:val="16"/>
-              </w:rPr>
-            </w:pPr>
-          </w:p>
-        </w:tc>
-        <w:tc>
-          <w:tcPr>
-            <w:tcW w:w="525" w:type="dxa"/>
+            <w:tcW w:w="520" w:type="dxa"/>
+          </w:tcPr>
+          <w:p>
+            <w:pPr>
+              <w:spacing w:line="360" w:lineRule="auto"/>
+              <w:jc w:val="both"/>
+              <w:rPr>
+                <w:b/>
+                <w:sz w:val="16"/>
+                <w:szCs w:val="16"/>
+              </w:rPr>
+            </w:pPr>
+          </w:p>
+        </w:tc>
+        <w:tc>
+          <w:tcPr>
+            <w:tcW w:w="520" w:type="dxa"/>
           </w:tcPr>
           <w:p>
             <w:pPr>
@@ -7732,263 +7732,274 @@
         </w:trPr>
         <w:tc>
           <w:tcPr>
-            <w:tcW w:w="1351" w:type="dxa"/>
-          </w:tcPr>
-          <w:p>
-            <w:pPr>
-              <w:spacing w:line="360" w:lineRule="auto"/>
-              <w:jc w:val="both"/>
-              <w:rPr>
-                <w:b/>
-                <w:sz w:val="16"/>
-                <w:szCs w:val="16"/>
-              </w:rPr>
-            </w:pPr>
-          </w:p>
-        </w:tc>
-        <w:tc>
-          <w:tcPr>
-            <w:tcW w:w="536" w:type="dxa"/>
-          </w:tcPr>
-          <w:p>
-            <w:pPr>
-              <w:spacing w:line="360" w:lineRule="auto"/>
-              <w:jc w:val="both"/>
-              <w:rPr>
-                <w:b/>
-                <w:sz w:val="16"/>
-                <w:szCs w:val="16"/>
-              </w:rPr>
-            </w:pPr>
-          </w:p>
-        </w:tc>
-        <w:tc>
-          <w:tcPr>
-            <w:tcW w:w="522" w:type="dxa"/>
-          </w:tcPr>
-          <w:p>
-            <w:pPr>
-              <w:spacing w:line="360" w:lineRule="auto"/>
-              <w:jc w:val="both"/>
-              <w:rPr>
-                <w:b/>
-                <w:sz w:val="16"/>
-                <w:szCs w:val="16"/>
-              </w:rPr>
-            </w:pPr>
-          </w:p>
-        </w:tc>
-        <w:tc>
-          <w:tcPr>
-            <w:tcW w:w="523" w:type="dxa"/>
-          </w:tcPr>
-          <w:p>
-            <w:pPr>
-              <w:spacing w:line="360" w:lineRule="auto"/>
-              <w:jc w:val="both"/>
-              <w:rPr>
-                <w:b/>
-                <w:sz w:val="16"/>
-                <w:szCs w:val="16"/>
-              </w:rPr>
-            </w:pPr>
-          </w:p>
-        </w:tc>
-        <w:tc>
-          <w:tcPr>
-            <w:tcW w:w="526" w:type="dxa"/>
-          </w:tcPr>
-          <w:p>
-            <w:pPr>
-              <w:spacing w:line="360" w:lineRule="auto"/>
-              <w:jc w:val="both"/>
-              <w:rPr>
-                <w:b/>
-                <w:sz w:val="16"/>
-                <w:szCs w:val="16"/>
-              </w:rPr>
-            </w:pPr>
-          </w:p>
-        </w:tc>
-        <w:tc>
-          <w:tcPr>
-            <w:tcW w:w="523" w:type="dxa"/>
-          </w:tcPr>
-          <w:p>
-            <w:pPr>
-              <w:spacing w:line="360" w:lineRule="auto"/>
-              <w:jc w:val="both"/>
-              <w:rPr>
-                <w:b/>
-                <w:sz w:val="16"/>
-                <w:szCs w:val="16"/>
-              </w:rPr>
-            </w:pPr>
-          </w:p>
-        </w:tc>
-        <w:tc>
-          <w:tcPr>
-            <w:tcW w:w="523" w:type="dxa"/>
-          </w:tcPr>
-          <w:p>
-            <w:pPr>
-              <w:spacing w:line="360" w:lineRule="auto"/>
-              <w:jc w:val="both"/>
-              <w:rPr>
-                <w:b/>
-                <w:sz w:val="16"/>
-                <w:szCs w:val="16"/>
-              </w:rPr>
-            </w:pPr>
-          </w:p>
-        </w:tc>
-        <w:tc>
-          <w:tcPr>
-            <w:tcW w:w="523" w:type="dxa"/>
-          </w:tcPr>
-          <w:p>
-            <w:pPr>
-              <w:spacing w:line="360" w:lineRule="auto"/>
-              <w:jc w:val="both"/>
-              <w:rPr>
-                <w:b/>
-                <w:sz w:val="16"/>
-                <w:szCs w:val="16"/>
-              </w:rPr>
-            </w:pPr>
-          </w:p>
-        </w:tc>
-        <w:tc>
-          <w:tcPr>
-            <w:tcW w:w="523" w:type="dxa"/>
-          </w:tcPr>
-          <w:p>
-            <w:pPr>
-              <w:spacing w:line="360" w:lineRule="auto"/>
-              <w:jc w:val="both"/>
-              <w:rPr>
-                <w:b/>
-                <w:sz w:val="16"/>
-                <w:szCs w:val="16"/>
-              </w:rPr>
-            </w:pPr>
-          </w:p>
-        </w:tc>
-        <w:tc>
-          <w:tcPr>
-            <w:tcW w:w="523" w:type="dxa"/>
-          </w:tcPr>
-          <w:p>
-            <w:pPr>
-              <w:spacing w:line="360" w:lineRule="auto"/>
-              <w:jc w:val="both"/>
-              <w:rPr>
-                <w:b/>
-                <w:sz w:val="16"/>
-                <w:szCs w:val="16"/>
-              </w:rPr>
-            </w:pPr>
-          </w:p>
-        </w:tc>
-        <w:tc>
-          <w:tcPr>
-            <w:tcW w:w="523" w:type="dxa"/>
-          </w:tcPr>
-          <w:p>
-            <w:pPr>
-              <w:spacing w:line="360" w:lineRule="auto"/>
-              <w:jc w:val="both"/>
-              <w:rPr>
-                <w:b/>
-                <w:sz w:val="16"/>
-                <w:szCs w:val="16"/>
-              </w:rPr>
-            </w:pPr>
-          </w:p>
-        </w:tc>
-        <w:tc>
-          <w:tcPr>
-            <w:tcW w:w="523" w:type="dxa"/>
-          </w:tcPr>
-          <w:p>
-            <w:pPr>
-              <w:spacing w:line="360" w:lineRule="auto"/>
-              <w:jc w:val="both"/>
-              <w:rPr>
-                <w:b/>
-                <w:sz w:val="16"/>
-                <w:szCs w:val="16"/>
-              </w:rPr>
-            </w:pPr>
-          </w:p>
-        </w:tc>
-        <w:tc>
-          <w:tcPr>
-            <w:tcW w:w="523" w:type="dxa"/>
-          </w:tcPr>
-          <w:p>
-            <w:pPr>
-              <w:spacing w:line="360" w:lineRule="auto"/>
-              <w:jc w:val="both"/>
-              <w:rPr>
-                <w:b/>
-                <w:sz w:val="16"/>
-                <w:szCs w:val="16"/>
-              </w:rPr>
-            </w:pPr>
-          </w:p>
-        </w:tc>
-        <w:tc>
-          <w:tcPr>
-            <w:tcW w:w="525" w:type="dxa"/>
-          </w:tcPr>
-          <w:p>
-            <w:pPr>
-              <w:spacing w:line="360" w:lineRule="auto"/>
-              <w:jc w:val="both"/>
-              <w:rPr>
-                <w:b/>
-                <w:sz w:val="16"/>
-                <w:szCs w:val="16"/>
-              </w:rPr>
-            </w:pPr>
-          </w:p>
-        </w:tc>
-        <w:tc>
-          <w:tcPr>
-            <w:tcW w:w="525" w:type="dxa"/>
-          </w:tcPr>
-          <w:p>
-            <w:pPr>
-              <w:spacing w:line="360" w:lineRule="auto"/>
-              <w:jc w:val="both"/>
-              <w:rPr>
-                <w:b/>
-                <w:sz w:val="16"/>
-                <w:szCs w:val="16"/>
-              </w:rPr>
-            </w:pPr>
-          </w:p>
-        </w:tc>
-        <w:tc>
-          <w:tcPr>
-            <w:tcW w:w="525" w:type="dxa"/>
-          </w:tcPr>
-          <w:p>
-            <w:pPr>
-              <w:spacing w:line="360" w:lineRule="auto"/>
-              <w:jc w:val="both"/>
-              <w:rPr>
-                <w:b/>
-                <w:sz w:val="16"/>
-                <w:szCs w:val="16"/>
-              </w:rPr>
-            </w:pPr>
-          </w:p>
-        </w:tc>
-        <w:tc>
-          <w:tcPr>
-            <w:tcW w:w="525" w:type="dxa"/>
+            <w:tcW w:w="1463" w:type="dxa"/>
+          </w:tcPr>
+          <w:p>
+            <w:pPr>
+              <w:spacing w:line="360" w:lineRule="auto"/>
+              <w:jc w:val="center"/>
+              <w:rPr>
+                <w:b/>
+                <w:sz w:val="16"/>
+                <w:szCs w:val="16"/>
+              </w:rPr>
+            </w:pPr>
+            <w:r>
+              <w:t>Entrevistas y levantamiento de requisitos</w:t>
+            </w:r>
+          </w:p>
+        </w:tc>
+        <w:tc>
+          <w:tcPr>
+            <w:tcW w:w="527" w:type="dxa"/>
+          </w:tcPr>
+          <w:p>
+            <w:pPr>
+              <w:spacing w:line="360" w:lineRule="auto"/>
+              <w:jc w:val="both"/>
+              <w:rPr>
+                <w:b/>
+                <w:sz w:val="16"/>
+                <w:szCs w:val="16"/>
+              </w:rPr>
+            </w:pPr>
+          </w:p>
+        </w:tc>
+        <w:tc>
+          <w:tcPr>
+            <w:tcW w:w="514" w:type="dxa"/>
+          </w:tcPr>
+          <w:p>
+            <w:pPr>
+              <w:spacing w:line="360" w:lineRule="auto"/>
+              <w:jc w:val="both"/>
+              <w:rPr>
+                <w:b/>
+                <w:sz w:val="16"/>
+                <w:szCs w:val="16"/>
+              </w:rPr>
+            </w:pPr>
+            <w:r>
+              <w:rPr>
+                <w:b/>
+                <w:sz w:val="20"/>
+                <w:szCs w:val="20"/>
+              </w:rPr>
+              <w:t>X</w:t>
+            </w:r>
+          </w:p>
+        </w:tc>
+        <w:tc>
+          <w:tcPr>
+            <w:tcW w:w="515" w:type="dxa"/>
+          </w:tcPr>
+          <w:p>
+            <w:pPr>
+              <w:spacing w:line="360" w:lineRule="auto"/>
+              <w:jc w:val="both"/>
+              <w:rPr>
+                <w:b/>
+                <w:sz w:val="16"/>
+                <w:szCs w:val="16"/>
+              </w:rPr>
+            </w:pPr>
+          </w:p>
+        </w:tc>
+        <w:tc>
+          <w:tcPr>
+            <w:tcW w:w="519" w:type="dxa"/>
+          </w:tcPr>
+          <w:p>
+            <w:pPr>
+              <w:spacing w:line="360" w:lineRule="auto"/>
+              <w:jc w:val="both"/>
+              <w:rPr>
+                <w:b/>
+                <w:sz w:val="16"/>
+                <w:szCs w:val="16"/>
+              </w:rPr>
+            </w:pPr>
+          </w:p>
+        </w:tc>
+        <w:tc>
+          <w:tcPr>
+            <w:tcW w:w="516" w:type="dxa"/>
+          </w:tcPr>
+          <w:p>
+            <w:pPr>
+              <w:spacing w:line="360" w:lineRule="auto"/>
+              <w:jc w:val="both"/>
+              <w:rPr>
+                <w:b/>
+                <w:sz w:val="16"/>
+                <w:szCs w:val="16"/>
+              </w:rPr>
+            </w:pPr>
+          </w:p>
+        </w:tc>
+        <w:tc>
+          <w:tcPr>
+            <w:tcW w:w="516" w:type="dxa"/>
+          </w:tcPr>
+          <w:p>
+            <w:pPr>
+              <w:spacing w:line="360" w:lineRule="auto"/>
+              <w:jc w:val="both"/>
+              <w:rPr>
+                <w:b/>
+                <w:sz w:val="16"/>
+                <w:szCs w:val="16"/>
+              </w:rPr>
+            </w:pPr>
+          </w:p>
+        </w:tc>
+        <w:tc>
+          <w:tcPr>
+            <w:tcW w:w="516" w:type="dxa"/>
+          </w:tcPr>
+          <w:p>
+            <w:pPr>
+              <w:spacing w:line="360" w:lineRule="auto"/>
+              <w:jc w:val="both"/>
+              <w:rPr>
+                <w:b/>
+                <w:sz w:val="16"/>
+                <w:szCs w:val="16"/>
+              </w:rPr>
+            </w:pPr>
+          </w:p>
+        </w:tc>
+        <w:tc>
+          <w:tcPr>
+            <w:tcW w:w="516" w:type="dxa"/>
+          </w:tcPr>
+          <w:p>
+            <w:pPr>
+              <w:spacing w:line="360" w:lineRule="auto"/>
+              <w:jc w:val="both"/>
+              <w:rPr>
+                <w:b/>
+                <w:sz w:val="16"/>
+                <w:szCs w:val="16"/>
+              </w:rPr>
+            </w:pPr>
+          </w:p>
+        </w:tc>
+        <w:tc>
+          <w:tcPr>
+            <w:tcW w:w="516" w:type="dxa"/>
+          </w:tcPr>
+          <w:p>
+            <w:pPr>
+              <w:spacing w:line="360" w:lineRule="auto"/>
+              <w:jc w:val="both"/>
+              <w:rPr>
+                <w:b/>
+                <w:sz w:val="16"/>
+                <w:szCs w:val="16"/>
+              </w:rPr>
+            </w:pPr>
+          </w:p>
+        </w:tc>
+        <w:tc>
+          <w:tcPr>
+            <w:tcW w:w="518" w:type="dxa"/>
+          </w:tcPr>
+          <w:p>
+            <w:pPr>
+              <w:spacing w:line="360" w:lineRule="auto"/>
+              <w:jc w:val="both"/>
+              <w:rPr>
+                <w:b/>
+                <w:sz w:val="16"/>
+                <w:szCs w:val="16"/>
+              </w:rPr>
+            </w:pPr>
+          </w:p>
+        </w:tc>
+        <w:tc>
+          <w:tcPr>
+            <w:tcW w:w="518" w:type="dxa"/>
+          </w:tcPr>
+          <w:p>
+            <w:pPr>
+              <w:spacing w:line="360" w:lineRule="auto"/>
+              <w:jc w:val="both"/>
+              <w:rPr>
+                <w:b/>
+                <w:sz w:val="16"/>
+                <w:szCs w:val="16"/>
+              </w:rPr>
+            </w:pPr>
+          </w:p>
+        </w:tc>
+        <w:tc>
+          <w:tcPr>
+            <w:tcW w:w="518" w:type="dxa"/>
+          </w:tcPr>
+          <w:p>
+            <w:pPr>
+              <w:spacing w:line="360" w:lineRule="auto"/>
+              <w:jc w:val="both"/>
+              <w:rPr>
+                <w:b/>
+                <w:sz w:val="16"/>
+                <w:szCs w:val="16"/>
+              </w:rPr>
+            </w:pPr>
+          </w:p>
+        </w:tc>
+        <w:tc>
+          <w:tcPr>
+            <w:tcW w:w="520" w:type="dxa"/>
+          </w:tcPr>
+          <w:p>
+            <w:pPr>
+              <w:spacing w:line="360" w:lineRule="auto"/>
+              <w:jc w:val="both"/>
+              <w:rPr>
+                <w:b/>
+                <w:sz w:val="16"/>
+                <w:szCs w:val="16"/>
+              </w:rPr>
+            </w:pPr>
+          </w:p>
+        </w:tc>
+        <w:tc>
+          <w:tcPr>
+            <w:tcW w:w="520" w:type="dxa"/>
+          </w:tcPr>
+          <w:p>
+            <w:pPr>
+              <w:spacing w:line="360" w:lineRule="auto"/>
+              <w:jc w:val="both"/>
+              <w:rPr>
+                <w:b/>
+                <w:sz w:val="16"/>
+                <w:szCs w:val="16"/>
+              </w:rPr>
+            </w:pPr>
+          </w:p>
+        </w:tc>
+        <w:tc>
+          <w:tcPr>
+            <w:tcW w:w="520" w:type="dxa"/>
+          </w:tcPr>
+          <w:p>
+            <w:pPr>
+              <w:spacing w:line="360" w:lineRule="auto"/>
+              <w:jc w:val="both"/>
+              <w:rPr>
+                <w:b/>
+                <w:sz w:val="16"/>
+                <w:szCs w:val="16"/>
+              </w:rPr>
+            </w:pPr>
+          </w:p>
+        </w:tc>
+        <w:tc>
+          <w:tcPr>
+            <w:tcW w:w="520" w:type="dxa"/>
             <w:gridSpan w:val="2"/>
           </w:tcPr>
           <w:p>
@@ -8005,23 +8016,23 @@
         </w:tc>
         <w:tc>
           <w:tcPr>
-            <w:tcW w:w="525" w:type="dxa"/>
-          </w:tcPr>
-          <w:p>
-            <w:pPr>
-              <w:spacing w:line="360" w:lineRule="auto"/>
-              <w:jc w:val="both"/>
-              <w:rPr>
-                <w:b/>
-                <w:sz w:val="16"/>
-                <w:szCs w:val="16"/>
-              </w:rPr>
-            </w:pPr>
-          </w:p>
-        </w:tc>
-        <w:tc>
-          <w:tcPr>
-            <w:tcW w:w="525" w:type="dxa"/>
+            <w:tcW w:w="520" w:type="dxa"/>
+          </w:tcPr>
+          <w:p>
+            <w:pPr>
+              <w:spacing w:line="360" w:lineRule="auto"/>
+              <w:jc w:val="both"/>
+              <w:rPr>
+                <w:b/>
+                <w:sz w:val="16"/>
+                <w:szCs w:val="16"/>
+              </w:rPr>
+            </w:pPr>
+          </w:p>
+        </w:tc>
+        <w:tc>
+          <w:tcPr>
+            <w:tcW w:w="520" w:type="dxa"/>
           </w:tcPr>
           <w:p>
             <w:pPr>
@@ -8044,263 +8055,274 @@
         </w:trPr>
         <w:tc>
           <w:tcPr>
-            <w:tcW w:w="1351" w:type="dxa"/>
-          </w:tcPr>
-          <w:p>
-            <w:pPr>
-              <w:spacing w:line="360" w:lineRule="auto"/>
-              <w:jc w:val="both"/>
-              <w:rPr>
-                <w:b/>
-                <w:sz w:val="16"/>
-                <w:szCs w:val="16"/>
-              </w:rPr>
-            </w:pPr>
-          </w:p>
-        </w:tc>
-        <w:tc>
-          <w:tcPr>
-            <w:tcW w:w="536" w:type="dxa"/>
-          </w:tcPr>
-          <w:p>
-            <w:pPr>
-              <w:spacing w:line="360" w:lineRule="auto"/>
-              <w:jc w:val="both"/>
-              <w:rPr>
-                <w:b/>
-                <w:sz w:val="16"/>
-                <w:szCs w:val="16"/>
-              </w:rPr>
-            </w:pPr>
-          </w:p>
-        </w:tc>
-        <w:tc>
-          <w:tcPr>
-            <w:tcW w:w="522" w:type="dxa"/>
-          </w:tcPr>
-          <w:p>
-            <w:pPr>
-              <w:spacing w:line="360" w:lineRule="auto"/>
-              <w:jc w:val="both"/>
-              <w:rPr>
-                <w:b/>
-                <w:sz w:val="16"/>
-                <w:szCs w:val="16"/>
-              </w:rPr>
-            </w:pPr>
-          </w:p>
-        </w:tc>
-        <w:tc>
-          <w:tcPr>
-            <w:tcW w:w="523" w:type="dxa"/>
-          </w:tcPr>
-          <w:p>
-            <w:pPr>
-              <w:spacing w:line="360" w:lineRule="auto"/>
-              <w:jc w:val="both"/>
-              <w:rPr>
-                <w:b/>
-                <w:sz w:val="16"/>
-                <w:szCs w:val="16"/>
-              </w:rPr>
-            </w:pPr>
-          </w:p>
-        </w:tc>
-        <w:tc>
-          <w:tcPr>
-            <w:tcW w:w="526" w:type="dxa"/>
-          </w:tcPr>
-          <w:p>
-            <w:pPr>
-              <w:spacing w:line="360" w:lineRule="auto"/>
-              <w:jc w:val="both"/>
-              <w:rPr>
-                <w:b/>
-                <w:sz w:val="16"/>
-                <w:szCs w:val="16"/>
-              </w:rPr>
-            </w:pPr>
-          </w:p>
-        </w:tc>
-        <w:tc>
-          <w:tcPr>
-            <w:tcW w:w="523" w:type="dxa"/>
-          </w:tcPr>
-          <w:p>
-            <w:pPr>
-              <w:spacing w:line="360" w:lineRule="auto"/>
-              <w:jc w:val="both"/>
-              <w:rPr>
-                <w:b/>
-                <w:sz w:val="16"/>
-                <w:szCs w:val="16"/>
-              </w:rPr>
-            </w:pPr>
-          </w:p>
-        </w:tc>
-        <w:tc>
-          <w:tcPr>
-            <w:tcW w:w="523" w:type="dxa"/>
-          </w:tcPr>
-          <w:p>
-            <w:pPr>
-              <w:spacing w:line="360" w:lineRule="auto"/>
-              <w:jc w:val="both"/>
-              <w:rPr>
-                <w:b/>
-                <w:sz w:val="16"/>
-                <w:szCs w:val="16"/>
-              </w:rPr>
-            </w:pPr>
-          </w:p>
-        </w:tc>
-        <w:tc>
-          <w:tcPr>
-            <w:tcW w:w="523" w:type="dxa"/>
-          </w:tcPr>
-          <w:p>
-            <w:pPr>
-              <w:spacing w:line="360" w:lineRule="auto"/>
-              <w:jc w:val="both"/>
-              <w:rPr>
-                <w:b/>
-                <w:sz w:val="16"/>
-                <w:szCs w:val="16"/>
-              </w:rPr>
-            </w:pPr>
-          </w:p>
-        </w:tc>
-        <w:tc>
-          <w:tcPr>
-            <w:tcW w:w="523" w:type="dxa"/>
-          </w:tcPr>
-          <w:p>
-            <w:pPr>
-              <w:spacing w:line="360" w:lineRule="auto"/>
-              <w:jc w:val="both"/>
-              <w:rPr>
-                <w:b/>
-                <w:sz w:val="16"/>
-                <w:szCs w:val="16"/>
-              </w:rPr>
-            </w:pPr>
-          </w:p>
-        </w:tc>
-        <w:tc>
-          <w:tcPr>
-            <w:tcW w:w="523" w:type="dxa"/>
-          </w:tcPr>
-          <w:p>
-            <w:pPr>
-              <w:spacing w:line="360" w:lineRule="auto"/>
-              <w:jc w:val="both"/>
-              <w:rPr>
-                <w:b/>
-                <w:sz w:val="16"/>
-                <w:szCs w:val="16"/>
-              </w:rPr>
-            </w:pPr>
-          </w:p>
-        </w:tc>
-        <w:tc>
-          <w:tcPr>
-            <w:tcW w:w="523" w:type="dxa"/>
-          </w:tcPr>
-          <w:p>
-            <w:pPr>
-              <w:spacing w:line="360" w:lineRule="auto"/>
-              <w:jc w:val="both"/>
-              <w:rPr>
-                <w:b/>
-                <w:sz w:val="16"/>
-                <w:szCs w:val="16"/>
-              </w:rPr>
-            </w:pPr>
-          </w:p>
-        </w:tc>
-        <w:tc>
-          <w:tcPr>
-            <w:tcW w:w="523" w:type="dxa"/>
-          </w:tcPr>
-          <w:p>
-            <w:pPr>
-              <w:spacing w:line="360" w:lineRule="auto"/>
-              <w:jc w:val="both"/>
-              <w:rPr>
-                <w:b/>
-                <w:sz w:val="16"/>
-                <w:szCs w:val="16"/>
-              </w:rPr>
-            </w:pPr>
-          </w:p>
-        </w:tc>
-        <w:tc>
-          <w:tcPr>
-            <w:tcW w:w="523" w:type="dxa"/>
-          </w:tcPr>
-          <w:p>
-            <w:pPr>
-              <w:spacing w:line="360" w:lineRule="auto"/>
-              <w:jc w:val="both"/>
-              <w:rPr>
-                <w:b/>
-                <w:sz w:val="16"/>
-                <w:szCs w:val="16"/>
-              </w:rPr>
-            </w:pPr>
-          </w:p>
-        </w:tc>
-        <w:tc>
-          <w:tcPr>
-            <w:tcW w:w="525" w:type="dxa"/>
-          </w:tcPr>
-          <w:p>
-            <w:pPr>
-              <w:spacing w:line="360" w:lineRule="auto"/>
-              <w:jc w:val="both"/>
-              <w:rPr>
-                <w:b/>
-                <w:sz w:val="16"/>
-                <w:szCs w:val="16"/>
-              </w:rPr>
-            </w:pPr>
-          </w:p>
-        </w:tc>
-        <w:tc>
-          <w:tcPr>
-            <w:tcW w:w="525" w:type="dxa"/>
-          </w:tcPr>
-          <w:p>
-            <w:pPr>
-              <w:spacing w:line="360" w:lineRule="auto"/>
-              <w:jc w:val="both"/>
-              <w:rPr>
-                <w:b/>
-                <w:sz w:val="16"/>
-                <w:szCs w:val="16"/>
-              </w:rPr>
-            </w:pPr>
-          </w:p>
-        </w:tc>
-        <w:tc>
-          <w:tcPr>
-            <w:tcW w:w="525" w:type="dxa"/>
-          </w:tcPr>
-          <w:p>
-            <w:pPr>
-              <w:spacing w:line="360" w:lineRule="auto"/>
-              <w:jc w:val="both"/>
-              <w:rPr>
-                <w:b/>
-                <w:sz w:val="16"/>
-                <w:szCs w:val="16"/>
-              </w:rPr>
-            </w:pPr>
-          </w:p>
-        </w:tc>
-        <w:tc>
-          <w:tcPr>
-            <w:tcW w:w="525" w:type="dxa"/>
+            <w:tcW w:w="1463" w:type="dxa"/>
+          </w:tcPr>
+          <w:p>
+            <w:pPr>
+              <w:spacing w:line="360" w:lineRule="auto"/>
+              <w:jc w:val="center"/>
+              <w:rPr>
+                <w:b/>
+                <w:sz w:val="16"/>
+                <w:szCs w:val="16"/>
+              </w:rPr>
+            </w:pPr>
+            <w:r>
+              <w:t>Análisis del flujo de trabajo</w:t>
+            </w:r>
+          </w:p>
+        </w:tc>
+        <w:tc>
+          <w:tcPr>
+            <w:tcW w:w="527" w:type="dxa"/>
+          </w:tcPr>
+          <w:p>
+            <w:pPr>
+              <w:spacing w:line="360" w:lineRule="auto"/>
+              <w:jc w:val="both"/>
+              <w:rPr>
+                <w:b/>
+                <w:sz w:val="16"/>
+                <w:szCs w:val="16"/>
+              </w:rPr>
+            </w:pPr>
+          </w:p>
+        </w:tc>
+        <w:tc>
+          <w:tcPr>
+            <w:tcW w:w="514" w:type="dxa"/>
+          </w:tcPr>
+          <w:p>
+            <w:pPr>
+              <w:spacing w:line="360" w:lineRule="auto"/>
+              <w:jc w:val="both"/>
+              <w:rPr>
+                <w:b/>
+                <w:sz w:val="16"/>
+                <w:szCs w:val="16"/>
+              </w:rPr>
+            </w:pPr>
+          </w:p>
+        </w:tc>
+        <w:tc>
+          <w:tcPr>
+            <w:tcW w:w="515" w:type="dxa"/>
+          </w:tcPr>
+          <w:p>
+            <w:pPr>
+              <w:spacing w:line="360" w:lineRule="auto"/>
+              <w:jc w:val="both"/>
+              <w:rPr>
+                <w:b/>
+                <w:sz w:val="16"/>
+                <w:szCs w:val="16"/>
+              </w:rPr>
+            </w:pPr>
+            <w:r>
+              <w:rPr>
+                <w:b/>
+                <w:sz w:val="20"/>
+                <w:szCs w:val="20"/>
+              </w:rPr>
+              <w:t>X</w:t>
+            </w:r>
+          </w:p>
+        </w:tc>
+        <w:tc>
+          <w:tcPr>
+            <w:tcW w:w="519" w:type="dxa"/>
+          </w:tcPr>
+          <w:p>
+            <w:pPr>
+              <w:spacing w:line="360" w:lineRule="auto"/>
+              <w:jc w:val="both"/>
+              <w:rPr>
+                <w:b/>
+                <w:sz w:val="16"/>
+                <w:szCs w:val="16"/>
+              </w:rPr>
+            </w:pPr>
+          </w:p>
+        </w:tc>
+        <w:tc>
+          <w:tcPr>
+            <w:tcW w:w="516" w:type="dxa"/>
+          </w:tcPr>
+          <w:p>
+            <w:pPr>
+              <w:spacing w:line="360" w:lineRule="auto"/>
+              <w:jc w:val="both"/>
+              <w:rPr>
+                <w:b/>
+                <w:sz w:val="16"/>
+                <w:szCs w:val="16"/>
+              </w:rPr>
+            </w:pPr>
+          </w:p>
+        </w:tc>
+        <w:tc>
+          <w:tcPr>
+            <w:tcW w:w="516" w:type="dxa"/>
+          </w:tcPr>
+          <w:p>
+            <w:pPr>
+              <w:spacing w:line="360" w:lineRule="auto"/>
+              <w:jc w:val="both"/>
+              <w:rPr>
+                <w:b/>
+                <w:sz w:val="16"/>
+                <w:szCs w:val="16"/>
+              </w:rPr>
+            </w:pPr>
+          </w:p>
+        </w:tc>
+        <w:tc>
+          <w:tcPr>
+            <w:tcW w:w="516" w:type="dxa"/>
+          </w:tcPr>
+          <w:p>
+            <w:pPr>
+              <w:spacing w:line="360" w:lineRule="auto"/>
+              <w:jc w:val="both"/>
+              <w:rPr>
+                <w:b/>
+                <w:sz w:val="16"/>
+                <w:szCs w:val="16"/>
+              </w:rPr>
+            </w:pPr>
+          </w:p>
+        </w:tc>
+        <w:tc>
+          <w:tcPr>
+            <w:tcW w:w="516" w:type="dxa"/>
+          </w:tcPr>
+          <w:p>
+            <w:pPr>
+              <w:spacing w:line="360" w:lineRule="auto"/>
+              <w:jc w:val="both"/>
+              <w:rPr>
+                <w:b/>
+                <w:sz w:val="16"/>
+                <w:szCs w:val="16"/>
+              </w:rPr>
+            </w:pPr>
+          </w:p>
+        </w:tc>
+        <w:tc>
+          <w:tcPr>
+            <w:tcW w:w="516" w:type="dxa"/>
+          </w:tcPr>
+          <w:p>
+            <w:pPr>
+              <w:spacing w:line="360" w:lineRule="auto"/>
+              <w:jc w:val="both"/>
+              <w:rPr>
+                <w:b/>
+                <w:sz w:val="16"/>
+                <w:szCs w:val="16"/>
+              </w:rPr>
+            </w:pPr>
+          </w:p>
+        </w:tc>
+        <w:tc>
+          <w:tcPr>
+            <w:tcW w:w="518" w:type="dxa"/>
+          </w:tcPr>
+          <w:p>
+            <w:pPr>
+              <w:spacing w:line="360" w:lineRule="auto"/>
+              <w:jc w:val="both"/>
+              <w:rPr>
+                <w:b/>
+                <w:sz w:val="16"/>
+                <w:szCs w:val="16"/>
+              </w:rPr>
+            </w:pPr>
+          </w:p>
+        </w:tc>
+        <w:tc>
+          <w:tcPr>
+            <w:tcW w:w="518" w:type="dxa"/>
+          </w:tcPr>
+          <w:p>
+            <w:pPr>
+              <w:spacing w:line="360" w:lineRule="auto"/>
+              <w:jc w:val="both"/>
+              <w:rPr>
+                <w:b/>
+                <w:sz w:val="16"/>
+                <w:szCs w:val="16"/>
+              </w:rPr>
+            </w:pPr>
+          </w:p>
+        </w:tc>
+        <w:tc>
+          <w:tcPr>
+            <w:tcW w:w="518" w:type="dxa"/>
+          </w:tcPr>
+          <w:p>
+            <w:pPr>
+              <w:spacing w:line="360" w:lineRule="auto"/>
+              <w:jc w:val="both"/>
+              <w:rPr>
+                <w:b/>
+                <w:sz w:val="16"/>
+                <w:szCs w:val="16"/>
+              </w:rPr>
+            </w:pPr>
+          </w:p>
+        </w:tc>
+        <w:tc>
+          <w:tcPr>
+            <w:tcW w:w="520" w:type="dxa"/>
+          </w:tcPr>
+          <w:p>
+            <w:pPr>
+              <w:spacing w:line="360" w:lineRule="auto"/>
+              <w:jc w:val="both"/>
+              <w:rPr>
+                <w:b/>
+                <w:sz w:val="16"/>
+                <w:szCs w:val="16"/>
+              </w:rPr>
+            </w:pPr>
+          </w:p>
+        </w:tc>
+        <w:tc>
+          <w:tcPr>
+            <w:tcW w:w="520" w:type="dxa"/>
+          </w:tcPr>
+          <w:p>
+            <w:pPr>
+              <w:spacing w:line="360" w:lineRule="auto"/>
+              <w:jc w:val="both"/>
+              <w:rPr>
+                <w:b/>
+                <w:sz w:val="16"/>
+                <w:szCs w:val="16"/>
+              </w:rPr>
+            </w:pPr>
+          </w:p>
+        </w:tc>
+        <w:tc>
+          <w:tcPr>
+            <w:tcW w:w="520" w:type="dxa"/>
+          </w:tcPr>
+          <w:p>
+            <w:pPr>
+              <w:spacing w:line="360" w:lineRule="auto"/>
+              <w:jc w:val="both"/>
+              <w:rPr>
+                <w:b/>
+                <w:sz w:val="16"/>
+                <w:szCs w:val="16"/>
+              </w:rPr>
+            </w:pPr>
+          </w:p>
+        </w:tc>
+        <w:tc>
+          <w:tcPr>
+            <w:tcW w:w="520" w:type="dxa"/>
             <w:gridSpan w:val="2"/>
           </w:tcPr>
           <w:p>
@@ -8317,34 +8339,2324 @@
         </w:tc>
         <w:tc>
           <w:tcPr>
-            <w:tcW w:w="525" w:type="dxa"/>
-          </w:tcPr>
-          <w:p>
-            <w:pPr>
-              <w:spacing w:line="360" w:lineRule="auto"/>
-              <w:jc w:val="both"/>
-              <w:rPr>
-                <w:b/>
-                <w:sz w:val="16"/>
-                <w:szCs w:val="16"/>
-              </w:rPr>
-            </w:pPr>
-          </w:p>
-        </w:tc>
-        <w:tc>
-          <w:tcPr>
-            <w:tcW w:w="525" w:type="dxa"/>
-          </w:tcPr>
-          <w:p>
-            <w:pPr>
-              <w:spacing w:line="360" w:lineRule="auto"/>
-              <w:jc w:val="both"/>
-              <w:rPr>
-                <w:b/>
-                <w:sz w:val="16"/>
-                <w:szCs w:val="16"/>
-              </w:rPr>
-            </w:pPr>
+            <w:tcW w:w="520" w:type="dxa"/>
+          </w:tcPr>
+          <w:p>
+            <w:pPr>
+              <w:spacing w:line="360" w:lineRule="auto"/>
+              <w:jc w:val="both"/>
+              <w:rPr>
+                <w:b/>
+                <w:sz w:val="16"/>
+                <w:szCs w:val="16"/>
+              </w:rPr>
+            </w:pPr>
+          </w:p>
+        </w:tc>
+        <w:tc>
+          <w:tcPr>
+            <w:tcW w:w="520" w:type="dxa"/>
+          </w:tcPr>
+          <w:p>
+            <w:pPr>
+              <w:spacing w:line="360" w:lineRule="auto"/>
+              <w:jc w:val="both"/>
+              <w:rPr>
+                <w:b/>
+                <w:sz w:val="16"/>
+                <w:szCs w:val="16"/>
+              </w:rPr>
+            </w:pPr>
+          </w:p>
+        </w:tc>
+      </w:tr>
+      <w:tr>
+        <w:trPr>
+          <w:gridAfter w:val="1"/>
+          <w:wAfter w:w="10" w:type="dxa"/>
+          <w:trHeight w:val="294"/>
+        </w:trPr>
+        <w:tc>
+          <w:tcPr>
+            <w:tcW w:w="1463" w:type="dxa"/>
+          </w:tcPr>
+          <w:p>
+            <w:pPr>
+              <w:spacing w:line="360" w:lineRule="auto"/>
+              <w:jc w:val="center"/>
+            </w:pPr>
+            <w:r>
+              <w:t>Diseño de arquitectura y modelo de datos</w:t>
+            </w:r>
+          </w:p>
+        </w:tc>
+        <w:tc>
+          <w:tcPr>
+            <w:tcW w:w="527" w:type="dxa"/>
+          </w:tcPr>
+          <w:p>
+            <w:pPr>
+              <w:spacing w:line="360" w:lineRule="auto"/>
+              <w:jc w:val="both"/>
+              <w:rPr>
+                <w:b/>
+                <w:sz w:val="16"/>
+                <w:szCs w:val="16"/>
+              </w:rPr>
+            </w:pPr>
+          </w:p>
+        </w:tc>
+        <w:tc>
+          <w:tcPr>
+            <w:tcW w:w="514" w:type="dxa"/>
+          </w:tcPr>
+          <w:p>
+            <w:pPr>
+              <w:spacing w:line="360" w:lineRule="auto"/>
+              <w:jc w:val="both"/>
+              <w:rPr>
+                <w:b/>
+                <w:sz w:val="16"/>
+                <w:szCs w:val="16"/>
+              </w:rPr>
+            </w:pPr>
+          </w:p>
+        </w:tc>
+        <w:tc>
+          <w:tcPr>
+            <w:tcW w:w="515" w:type="dxa"/>
+          </w:tcPr>
+          <w:p>
+            <w:pPr>
+              <w:spacing w:line="360" w:lineRule="auto"/>
+              <w:jc w:val="both"/>
+              <w:rPr>
+                <w:b/>
+                <w:sz w:val="16"/>
+                <w:szCs w:val="16"/>
+              </w:rPr>
+            </w:pPr>
+          </w:p>
+        </w:tc>
+        <w:tc>
+          <w:tcPr>
+            <w:tcW w:w="519" w:type="dxa"/>
+          </w:tcPr>
+          <w:p>
+            <w:pPr>
+              <w:spacing w:line="360" w:lineRule="auto"/>
+              <w:jc w:val="both"/>
+              <w:rPr>
+                <w:b/>
+                <w:sz w:val="16"/>
+                <w:szCs w:val="16"/>
+              </w:rPr>
+            </w:pPr>
+            <w:r>
+              <w:rPr>
+                <w:b/>
+                <w:sz w:val="20"/>
+                <w:szCs w:val="20"/>
+              </w:rPr>
+              <w:t>X</w:t>
+            </w:r>
+          </w:p>
+        </w:tc>
+        <w:tc>
+          <w:tcPr>
+            <w:tcW w:w="516" w:type="dxa"/>
+          </w:tcPr>
+          <w:p>
+            <w:pPr>
+              <w:spacing w:line="360" w:lineRule="auto"/>
+              <w:jc w:val="both"/>
+              <w:rPr>
+                <w:b/>
+                <w:sz w:val="16"/>
+                <w:szCs w:val="16"/>
+              </w:rPr>
+            </w:pPr>
+          </w:p>
+        </w:tc>
+        <w:tc>
+          <w:tcPr>
+            <w:tcW w:w="516" w:type="dxa"/>
+          </w:tcPr>
+          <w:p>
+            <w:pPr>
+              <w:spacing w:line="360" w:lineRule="auto"/>
+              <w:jc w:val="both"/>
+              <w:rPr>
+                <w:b/>
+                <w:sz w:val="16"/>
+                <w:szCs w:val="16"/>
+              </w:rPr>
+            </w:pPr>
+          </w:p>
+        </w:tc>
+        <w:tc>
+          <w:tcPr>
+            <w:tcW w:w="516" w:type="dxa"/>
+          </w:tcPr>
+          <w:p>
+            <w:pPr>
+              <w:spacing w:line="360" w:lineRule="auto"/>
+              <w:jc w:val="both"/>
+              <w:rPr>
+                <w:b/>
+                <w:sz w:val="16"/>
+                <w:szCs w:val="16"/>
+              </w:rPr>
+            </w:pPr>
+          </w:p>
+        </w:tc>
+        <w:tc>
+          <w:tcPr>
+            <w:tcW w:w="516" w:type="dxa"/>
+          </w:tcPr>
+          <w:p>
+            <w:pPr>
+              <w:spacing w:line="360" w:lineRule="auto"/>
+              <w:jc w:val="both"/>
+              <w:rPr>
+                <w:b/>
+                <w:sz w:val="16"/>
+                <w:szCs w:val="16"/>
+              </w:rPr>
+            </w:pPr>
+          </w:p>
+        </w:tc>
+        <w:tc>
+          <w:tcPr>
+            <w:tcW w:w="516" w:type="dxa"/>
+          </w:tcPr>
+          <w:p>
+            <w:pPr>
+              <w:spacing w:line="360" w:lineRule="auto"/>
+              <w:jc w:val="both"/>
+              <w:rPr>
+                <w:b/>
+                <w:sz w:val="16"/>
+                <w:szCs w:val="16"/>
+              </w:rPr>
+            </w:pPr>
+          </w:p>
+        </w:tc>
+        <w:tc>
+          <w:tcPr>
+            <w:tcW w:w="518" w:type="dxa"/>
+          </w:tcPr>
+          <w:p>
+            <w:pPr>
+              <w:spacing w:line="360" w:lineRule="auto"/>
+              <w:jc w:val="both"/>
+              <w:rPr>
+                <w:b/>
+                <w:sz w:val="16"/>
+                <w:szCs w:val="16"/>
+              </w:rPr>
+            </w:pPr>
+          </w:p>
+        </w:tc>
+        <w:tc>
+          <w:tcPr>
+            <w:tcW w:w="518" w:type="dxa"/>
+          </w:tcPr>
+          <w:p>
+            <w:pPr>
+              <w:spacing w:line="360" w:lineRule="auto"/>
+              <w:jc w:val="both"/>
+              <w:rPr>
+                <w:b/>
+                <w:sz w:val="16"/>
+                <w:szCs w:val="16"/>
+              </w:rPr>
+            </w:pPr>
+          </w:p>
+        </w:tc>
+        <w:tc>
+          <w:tcPr>
+            <w:tcW w:w="518" w:type="dxa"/>
+          </w:tcPr>
+          <w:p>
+            <w:pPr>
+              <w:spacing w:line="360" w:lineRule="auto"/>
+              <w:jc w:val="both"/>
+              <w:rPr>
+                <w:b/>
+                <w:sz w:val="16"/>
+                <w:szCs w:val="16"/>
+              </w:rPr>
+            </w:pPr>
+          </w:p>
+        </w:tc>
+        <w:tc>
+          <w:tcPr>
+            <w:tcW w:w="520" w:type="dxa"/>
+          </w:tcPr>
+          <w:p>
+            <w:pPr>
+              <w:spacing w:line="360" w:lineRule="auto"/>
+              <w:jc w:val="both"/>
+              <w:rPr>
+                <w:b/>
+                <w:sz w:val="16"/>
+                <w:szCs w:val="16"/>
+              </w:rPr>
+            </w:pPr>
+          </w:p>
+        </w:tc>
+        <w:tc>
+          <w:tcPr>
+            <w:tcW w:w="520" w:type="dxa"/>
+          </w:tcPr>
+          <w:p>
+            <w:pPr>
+              <w:spacing w:line="360" w:lineRule="auto"/>
+              <w:jc w:val="both"/>
+              <w:rPr>
+                <w:b/>
+                <w:sz w:val="16"/>
+                <w:szCs w:val="16"/>
+              </w:rPr>
+            </w:pPr>
+          </w:p>
+        </w:tc>
+        <w:tc>
+          <w:tcPr>
+            <w:tcW w:w="520" w:type="dxa"/>
+          </w:tcPr>
+          <w:p>
+            <w:pPr>
+              <w:spacing w:line="360" w:lineRule="auto"/>
+              <w:jc w:val="both"/>
+              <w:rPr>
+                <w:b/>
+                <w:sz w:val="16"/>
+                <w:szCs w:val="16"/>
+              </w:rPr>
+            </w:pPr>
+          </w:p>
+        </w:tc>
+        <w:tc>
+          <w:tcPr>
+            <w:tcW w:w="520" w:type="dxa"/>
+            <w:gridSpan w:val="2"/>
+          </w:tcPr>
+          <w:p>
+            <w:pPr>
+              <w:spacing w:line="360" w:lineRule="auto"/>
+              <w:jc w:val="both"/>
+              <w:rPr>
+                <w:b/>
+                <w:sz w:val="16"/>
+                <w:szCs w:val="16"/>
+              </w:rPr>
+            </w:pPr>
+          </w:p>
+        </w:tc>
+        <w:tc>
+          <w:tcPr>
+            <w:tcW w:w="520" w:type="dxa"/>
+          </w:tcPr>
+          <w:p>
+            <w:pPr>
+              <w:spacing w:line="360" w:lineRule="auto"/>
+              <w:jc w:val="both"/>
+              <w:rPr>
+                <w:b/>
+                <w:sz w:val="16"/>
+                <w:szCs w:val="16"/>
+              </w:rPr>
+            </w:pPr>
+          </w:p>
+        </w:tc>
+        <w:tc>
+          <w:tcPr>
+            <w:tcW w:w="520" w:type="dxa"/>
+          </w:tcPr>
+          <w:p>
+            <w:pPr>
+              <w:spacing w:line="360" w:lineRule="auto"/>
+              <w:jc w:val="both"/>
+              <w:rPr>
+                <w:b/>
+                <w:sz w:val="16"/>
+                <w:szCs w:val="16"/>
+              </w:rPr>
+            </w:pPr>
+          </w:p>
+        </w:tc>
+      </w:tr>
+      <w:tr>
+        <w:trPr>
+          <w:gridAfter w:val="1"/>
+          <w:wAfter w:w="10" w:type="dxa"/>
+          <w:trHeight w:val="294"/>
+        </w:trPr>
+        <w:tc>
+          <w:tcPr>
+            <w:tcW w:w="1463" w:type="dxa"/>
+          </w:tcPr>
+          <w:p>
+            <w:pPr>
+              <w:spacing w:line="360" w:lineRule="auto"/>
+              <w:jc w:val="center"/>
+            </w:pPr>
+            <w:r>
+              <w:t>Diseño de agentes de IA</w:t>
+            </w:r>
+          </w:p>
+        </w:tc>
+        <w:tc>
+          <w:tcPr>
+            <w:tcW w:w="527" w:type="dxa"/>
+          </w:tcPr>
+          <w:p>
+            <w:pPr>
+              <w:spacing w:line="360" w:lineRule="auto"/>
+              <w:jc w:val="both"/>
+              <w:rPr>
+                <w:b/>
+                <w:sz w:val="16"/>
+                <w:szCs w:val="16"/>
+              </w:rPr>
+            </w:pPr>
+          </w:p>
+        </w:tc>
+        <w:tc>
+          <w:tcPr>
+            <w:tcW w:w="514" w:type="dxa"/>
+          </w:tcPr>
+          <w:p>
+            <w:pPr>
+              <w:spacing w:line="360" w:lineRule="auto"/>
+              <w:jc w:val="both"/>
+              <w:rPr>
+                <w:b/>
+                <w:sz w:val="16"/>
+                <w:szCs w:val="16"/>
+              </w:rPr>
+            </w:pPr>
+          </w:p>
+        </w:tc>
+        <w:tc>
+          <w:tcPr>
+            <w:tcW w:w="515" w:type="dxa"/>
+          </w:tcPr>
+          <w:p>
+            <w:pPr>
+              <w:spacing w:line="360" w:lineRule="auto"/>
+              <w:jc w:val="both"/>
+              <w:rPr>
+                <w:b/>
+                <w:sz w:val="16"/>
+                <w:szCs w:val="16"/>
+              </w:rPr>
+            </w:pPr>
+          </w:p>
+        </w:tc>
+        <w:tc>
+          <w:tcPr>
+            <w:tcW w:w="519" w:type="dxa"/>
+          </w:tcPr>
+          <w:p>
+            <w:pPr>
+              <w:spacing w:line="360" w:lineRule="auto"/>
+              <w:jc w:val="both"/>
+              <w:rPr>
+                <w:b/>
+                <w:sz w:val="16"/>
+                <w:szCs w:val="16"/>
+              </w:rPr>
+            </w:pPr>
+          </w:p>
+        </w:tc>
+        <w:tc>
+          <w:tcPr>
+            <w:tcW w:w="516" w:type="dxa"/>
+          </w:tcPr>
+          <w:p>
+            <w:pPr>
+              <w:spacing w:line="360" w:lineRule="auto"/>
+              <w:jc w:val="both"/>
+              <w:rPr>
+                <w:b/>
+                <w:sz w:val="16"/>
+                <w:szCs w:val="16"/>
+              </w:rPr>
+            </w:pPr>
+            <w:r>
+              <w:rPr>
+                <w:b/>
+                <w:sz w:val="20"/>
+                <w:szCs w:val="20"/>
+              </w:rPr>
+              <w:t>X</w:t>
+            </w:r>
+          </w:p>
+        </w:tc>
+        <w:tc>
+          <w:tcPr>
+            <w:tcW w:w="516" w:type="dxa"/>
+          </w:tcPr>
+          <w:p>
+            <w:pPr>
+              <w:spacing w:line="360" w:lineRule="auto"/>
+              <w:jc w:val="both"/>
+              <w:rPr>
+                <w:b/>
+                <w:sz w:val="16"/>
+                <w:szCs w:val="16"/>
+              </w:rPr>
+            </w:pPr>
+          </w:p>
+        </w:tc>
+        <w:tc>
+          <w:tcPr>
+            <w:tcW w:w="516" w:type="dxa"/>
+          </w:tcPr>
+          <w:p>
+            <w:pPr>
+              <w:spacing w:line="360" w:lineRule="auto"/>
+              <w:jc w:val="both"/>
+              <w:rPr>
+                <w:b/>
+                <w:sz w:val="16"/>
+                <w:szCs w:val="16"/>
+              </w:rPr>
+            </w:pPr>
+          </w:p>
+        </w:tc>
+        <w:tc>
+          <w:tcPr>
+            <w:tcW w:w="516" w:type="dxa"/>
+          </w:tcPr>
+          <w:p>
+            <w:pPr>
+              <w:spacing w:line="360" w:lineRule="auto"/>
+              <w:jc w:val="both"/>
+              <w:rPr>
+                <w:b/>
+                <w:sz w:val="16"/>
+                <w:szCs w:val="16"/>
+              </w:rPr>
+            </w:pPr>
+          </w:p>
+        </w:tc>
+        <w:tc>
+          <w:tcPr>
+            <w:tcW w:w="516" w:type="dxa"/>
+          </w:tcPr>
+          <w:p>
+            <w:pPr>
+              <w:spacing w:line="360" w:lineRule="auto"/>
+              <w:jc w:val="both"/>
+              <w:rPr>
+                <w:b/>
+                <w:sz w:val="16"/>
+                <w:szCs w:val="16"/>
+              </w:rPr>
+            </w:pPr>
+          </w:p>
+        </w:tc>
+        <w:tc>
+          <w:tcPr>
+            <w:tcW w:w="518" w:type="dxa"/>
+          </w:tcPr>
+          <w:p>
+            <w:pPr>
+              <w:spacing w:line="360" w:lineRule="auto"/>
+              <w:jc w:val="both"/>
+              <w:rPr>
+                <w:b/>
+                <w:sz w:val="16"/>
+                <w:szCs w:val="16"/>
+              </w:rPr>
+            </w:pPr>
+          </w:p>
+        </w:tc>
+        <w:tc>
+          <w:tcPr>
+            <w:tcW w:w="518" w:type="dxa"/>
+          </w:tcPr>
+          <w:p>
+            <w:pPr>
+              <w:spacing w:line="360" w:lineRule="auto"/>
+              <w:jc w:val="both"/>
+              <w:rPr>
+                <w:b/>
+                <w:sz w:val="16"/>
+                <w:szCs w:val="16"/>
+              </w:rPr>
+            </w:pPr>
+          </w:p>
+        </w:tc>
+        <w:tc>
+          <w:tcPr>
+            <w:tcW w:w="518" w:type="dxa"/>
+          </w:tcPr>
+          <w:p>
+            <w:pPr>
+              <w:spacing w:line="360" w:lineRule="auto"/>
+              <w:jc w:val="both"/>
+              <w:rPr>
+                <w:b/>
+                <w:sz w:val="16"/>
+                <w:szCs w:val="16"/>
+              </w:rPr>
+            </w:pPr>
+          </w:p>
+        </w:tc>
+        <w:tc>
+          <w:tcPr>
+            <w:tcW w:w="520" w:type="dxa"/>
+          </w:tcPr>
+          <w:p>
+            <w:pPr>
+              <w:spacing w:line="360" w:lineRule="auto"/>
+              <w:jc w:val="both"/>
+              <w:rPr>
+                <w:b/>
+                <w:sz w:val="16"/>
+                <w:szCs w:val="16"/>
+              </w:rPr>
+            </w:pPr>
+          </w:p>
+        </w:tc>
+        <w:tc>
+          <w:tcPr>
+            <w:tcW w:w="520" w:type="dxa"/>
+          </w:tcPr>
+          <w:p>
+            <w:pPr>
+              <w:spacing w:line="360" w:lineRule="auto"/>
+              <w:jc w:val="both"/>
+              <w:rPr>
+                <w:b/>
+                <w:sz w:val="16"/>
+                <w:szCs w:val="16"/>
+              </w:rPr>
+            </w:pPr>
+          </w:p>
+        </w:tc>
+        <w:tc>
+          <w:tcPr>
+            <w:tcW w:w="520" w:type="dxa"/>
+          </w:tcPr>
+          <w:p>
+            <w:pPr>
+              <w:spacing w:line="360" w:lineRule="auto"/>
+              <w:jc w:val="both"/>
+              <w:rPr>
+                <w:b/>
+                <w:sz w:val="16"/>
+                <w:szCs w:val="16"/>
+              </w:rPr>
+            </w:pPr>
+          </w:p>
+        </w:tc>
+        <w:tc>
+          <w:tcPr>
+            <w:tcW w:w="520" w:type="dxa"/>
+            <w:gridSpan w:val="2"/>
+          </w:tcPr>
+          <w:p>
+            <w:pPr>
+              <w:spacing w:line="360" w:lineRule="auto"/>
+              <w:jc w:val="both"/>
+              <w:rPr>
+                <w:b/>
+                <w:sz w:val="16"/>
+                <w:szCs w:val="16"/>
+              </w:rPr>
+            </w:pPr>
+          </w:p>
+        </w:tc>
+        <w:tc>
+          <w:tcPr>
+            <w:tcW w:w="520" w:type="dxa"/>
+          </w:tcPr>
+          <w:p>
+            <w:pPr>
+              <w:spacing w:line="360" w:lineRule="auto"/>
+              <w:jc w:val="both"/>
+              <w:rPr>
+                <w:b/>
+                <w:sz w:val="16"/>
+                <w:szCs w:val="16"/>
+              </w:rPr>
+            </w:pPr>
+          </w:p>
+        </w:tc>
+        <w:tc>
+          <w:tcPr>
+            <w:tcW w:w="520" w:type="dxa"/>
+          </w:tcPr>
+          <w:p>
+            <w:pPr>
+              <w:spacing w:line="360" w:lineRule="auto"/>
+              <w:jc w:val="both"/>
+              <w:rPr>
+                <w:b/>
+                <w:sz w:val="16"/>
+                <w:szCs w:val="16"/>
+              </w:rPr>
+            </w:pPr>
+          </w:p>
+        </w:tc>
+      </w:tr>
+      <w:tr>
+        <w:trPr>
+          <w:gridAfter w:val="1"/>
+          <w:wAfter w:w="10" w:type="dxa"/>
+          <w:trHeight w:val="294"/>
+        </w:trPr>
+        <w:tc>
+          <w:tcPr>
+            <w:tcW w:w="1463" w:type="dxa"/>
+          </w:tcPr>
+          <w:p>
+            <w:pPr>
+              <w:spacing w:line="360" w:lineRule="auto"/>
+              <w:jc w:val="center"/>
+            </w:pPr>
+            <w:r>
+              <w:t>Desarrollo Sprint 1 – Módulo de cotización</w:t>
+            </w:r>
+          </w:p>
+        </w:tc>
+        <w:tc>
+          <w:tcPr>
+            <w:tcW w:w="527" w:type="dxa"/>
+          </w:tcPr>
+          <w:p>
+            <w:pPr>
+              <w:spacing w:line="360" w:lineRule="auto"/>
+              <w:jc w:val="both"/>
+              <w:rPr>
+                <w:b/>
+                <w:sz w:val="16"/>
+                <w:szCs w:val="16"/>
+              </w:rPr>
+            </w:pPr>
+          </w:p>
+        </w:tc>
+        <w:tc>
+          <w:tcPr>
+            <w:tcW w:w="514" w:type="dxa"/>
+          </w:tcPr>
+          <w:p>
+            <w:pPr>
+              <w:spacing w:line="360" w:lineRule="auto"/>
+              <w:jc w:val="both"/>
+              <w:rPr>
+                <w:b/>
+                <w:sz w:val="16"/>
+                <w:szCs w:val="16"/>
+              </w:rPr>
+            </w:pPr>
+          </w:p>
+        </w:tc>
+        <w:tc>
+          <w:tcPr>
+            <w:tcW w:w="515" w:type="dxa"/>
+          </w:tcPr>
+          <w:p>
+            <w:pPr>
+              <w:spacing w:line="360" w:lineRule="auto"/>
+              <w:jc w:val="both"/>
+              <w:rPr>
+                <w:b/>
+                <w:sz w:val="16"/>
+                <w:szCs w:val="16"/>
+              </w:rPr>
+            </w:pPr>
+          </w:p>
+        </w:tc>
+        <w:tc>
+          <w:tcPr>
+            <w:tcW w:w="519" w:type="dxa"/>
+          </w:tcPr>
+          <w:p>
+            <w:pPr>
+              <w:spacing w:line="360" w:lineRule="auto"/>
+              <w:jc w:val="both"/>
+              <w:rPr>
+                <w:b/>
+                <w:sz w:val="16"/>
+                <w:szCs w:val="16"/>
+              </w:rPr>
+            </w:pPr>
+          </w:p>
+        </w:tc>
+        <w:tc>
+          <w:tcPr>
+            <w:tcW w:w="516" w:type="dxa"/>
+          </w:tcPr>
+          <w:p>
+            <w:pPr>
+              <w:spacing w:line="360" w:lineRule="auto"/>
+              <w:jc w:val="both"/>
+              <w:rPr>
+                <w:b/>
+                <w:sz w:val="16"/>
+                <w:szCs w:val="16"/>
+              </w:rPr>
+            </w:pPr>
+          </w:p>
+        </w:tc>
+        <w:tc>
+          <w:tcPr>
+            <w:tcW w:w="516" w:type="dxa"/>
+          </w:tcPr>
+          <w:p>
+            <w:pPr>
+              <w:spacing w:line="360" w:lineRule="auto"/>
+              <w:jc w:val="both"/>
+              <w:rPr>
+                <w:b/>
+                <w:sz w:val="16"/>
+                <w:szCs w:val="16"/>
+              </w:rPr>
+            </w:pPr>
+            <w:r>
+              <w:rPr>
+                <w:b/>
+                <w:sz w:val="20"/>
+                <w:szCs w:val="20"/>
+              </w:rPr>
+              <w:t>X</w:t>
+            </w:r>
+          </w:p>
+        </w:tc>
+        <w:tc>
+          <w:tcPr>
+            <w:tcW w:w="516" w:type="dxa"/>
+          </w:tcPr>
+          <w:p>
+            <w:pPr>
+              <w:spacing w:line="360" w:lineRule="auto"/>
+              <w:jc w:val="both"/>
+              <w:rPr>
+                <w:b/>
+                <w:sz w:val="16"/>
+                <w:szCs w:val="16"/>
+              </w:rPr>
+            </w:pPr>
+            <w:r>
+              <w:rPr>
+                <w:b/>
+                <w:sz w:val="20"/>
+                <w:szCs w:val="20"/>
+              </w:rPr>
+              <w:t>X</w:t>
+            </w:r>
+          </w:p>
+        </w:tc>
+        <w:tc>
+          <w:tcPr>
+            <w:tcW w:w="516" w:type="dxa"/>
+          </w:tcPr>
+          <w:p>
+            <w:pPr>
+              <w:spacing w:line="360" w:lineRule="auto"/>
+              <w:jc w:val="both"/>
+              <w:rPr>
+                <w:b/>
+                <w:sz w:val="16"/>
+                <w:szCs w:val="16"/>
+              </w:rPr>
+            </w:pPr>
+            <w:r>
+              <w:rPr>
+                <w:b/>
+                <w:sz w:val="20"/>
+                <w:szCs w:val="20"/>
+              </w:rPr>
+              <w:t>X</w:t>
+            </w:r>
+          </w:p>
+        </w:tc>
+        <w:tc>
+          <w:tcPr>
+            <w:tcW w:w="516" w:type="dxa"/>
+          </w:tcPr>
+          <w:p>
+            <w:pPr>
+              <w:spacing w:line="360" w:lineRule="auto"/>
+              <w:jc w:val="both"/>
+              <w:rPr>
+                <w:b/>
+                <w:sz w:val="16"/>
+                <w:szCs w:val="16"/>
+              </w:rPr>
+            </w:pPr>
+          </w:p>
+        </w:tc>
+        <w:tc>
+          <w:tcPr>
+            <w:tcW w:w="518" w:type="dxa"/>
+          </w:tcPr>
+          <w:p>
+            <w:pPr>
+              <w:spacing w:line="360" w:lineRule="auto"/>
+              <w:jc w:val="both"/>
+              <w:rPr>
+                <w:b/>
+                <w:sz w:val="16"/>
+                <w:szCs w:val="16"/>
+              </w:rPr>
+            </w:pPr>
+          </w:p>
+        </w:tc>
+        <w:tc>
+          <w:tcPr>
+            <w:tcW w:w="518" w:type="dxa"/>
+          </w:tcPr>
+          <w:p>
+            <w:pPr>
+              <w:spacing w:line="360" w:lineRule="auto"/>
+              <w:jc w:val="both"/>
+              <w:rPr>
+                <w:b/>
+                <w:sz w:val="16"/>
+                <w:szCs w:val="16"/>
+              </w:rPr>
+            </w:pPr>
+          </w:p>
+        </w:tc>
+        <w:tc>
+          <w:tcPr>
+            <w:tcW w:w="518" w:type="dxa"/>
+          </w:tcPr>
+          <w:p>
+            <w:pPr>
+              <w:spacing w:line="360" w:lineRule="auto"/>
+              <w:jc w:val="both"/>
+              <w:rPr>
+                <w:b/>
+                <w:sz w:val="16"/>
+                <w:szCs w:val="16"/>
+              </w:rPr>
+            </w:pPr>
+          </w:p>
+        </w:tc>
+        <w:tc>
+          <w:tcPr>
+            <w:tcW w:w="520" w:type="dxa"/>
+          </w:tcPr>
+          <w:p>
+            <w:pPr>
+              <w:spacing w:line="360" w:lineRule="auto"/>
+              <w:jc w:val="both"/>
+              <w:rPr>
+                <w:b/>
+                <w:sz w:val="16"/>
+                <w:szCs w:val="16"/>
+              </w:rPr>
+            </w:pPr>
+          </w:p>
+        </w:tc>
+        <w:tc>
+          <w:tcPr>
+            <w:tcW w:w="520" w:type="dxa"/>
+          </w:tcPr>
+          <w:p>
+            <w:pPr>
+              <w:spacing w:line="360" w:lineRule="auto"/>
+              <w:jc w:val="both"/>
+              <w:rPr>
+                <w:b/>
+                <w:sz w:val="16"/>
+                <w:szCs w:val="16"/>
+              </w:rPr>
+            </w:pPr>
+          </w:p>
+        </w:tc>
+        <w:tc>
+          <w:tcPr>
+            <w:tcW w:w="520" w:type="dxa"/>
+          </w:tcPr>
+          <w:p>
+            <w:pPr>
+              <w:spacing w:line="360" w:lineRule="auto"/>
+              <w:jc w:val="both"/>
+              <w:rPr>
+                <w:b/>
+                <w:sz w:val="16"/>
+                <w:szCs w:val="16"/>
+              </w:rPr>
+            </w:pPr>
+          </w:p>
+        </w:tc>
+        <w:tc>
+          <w:tcPr>
+            <w:tcW w:w="520" w:type="dxa"/>
+            <w:gridSpan w:val="2"/>
+          </w:tcPr>
+          <w:p>
+            <w:pPr>
+              <w:spacing w:line="360" w:lineRule="auto"/>
+              <w:jc w:val="both"/>
+              <w:rPr>
+                <w:b/>
+                <w:sz w:val="16"/>
+                <w:szCs w:val="16"/>
+              </w:rPr>
+            </w:pPr>
+          </w:p>
+        </w:tc>
+        <w:tc>
+          <w:tcPr>
+            <w:tcW w:w="520" w:type="dxa"/>
+          </w:tcPr>
+          <w:p>
+            <w:pPr>
+              <w:spacing w:line="360" w:lineRule="auto"/>
+              <w:jc w:val="both"/>
+              <w:rPr>
+                <w:b/>
+                <w:sz w:val="16"/>
+                <w:szCs w:val="16"/>
+              </w:rPr>
+            </w:pPr>
+          </w:p>
+        </w:tc>
+        <w:tc>
+          <w:tcPr>
+            <w:tcW w:w="520" w:type="dxa"/>
+          </w:tcPr>
+          <w:p>
+            <w:pPr>
+              <w:spacing w:line="360" w:lineRule="auto"/>
+              <w:jc w:val="both"/>
+              <w:rPr>
+                <w:b/>
+                <w:sz w:val="16"/>
+                <w:szCs w:val="16"/>
+              </w:rPr>
+            </w:pPr>
+          </w:p>
+        </w:tc>
+      </w:tr>
+      <w:tr>
+        <w:trPr>
+          <w:gridAfter w:val="1"/>
+          <w:wAfter w:w="10" w:type="dxa"/>
+          <w:trHeight w:val="294"/>
+        </w:trPr>
+        <w:tc>
+          <w:tcPr>
+            <w:tcW w:w="1463" w:type="dxa"/>
+          </w:tcPr>
+          <w:p>
+            <w:pPr>
+              <w:spacing w:line="360" w:lineRule="auto"/>
+              <w:jc w:val="center"/>
+            </w:pPr>
+            <w:r>
+              <w:t>Desarrollo Sprint 2 – Módulo de supervisión y fases del cliente</w:t>
+            </w:r>
+          </w:p>
+        </w:tc>
+        <w:tc>
+          <w:tcPr>
+            <w:tcW w:w="527" w:type="dxa"/>
+          </w:tcPr>
+          <w:p>
+            <w:pPr>
+              <w:spacing w:line="360" w:lineRule="auto"/>
+              <w:jc w:val="both"/>
+              <w:rPr>
+                <w:b/>
+                <w:sz w:val="16"/>
+                <w:szCs w:val="16"/>
+              </w:rPr>
+            </w:pPr>
+          </w:p>
+        </w:tc>
+        <w:tc>
+          <w:tcPr>
+            <w:tcW w:w="514" w:type="dxa"/>
+          </w:tcPr>
+          <w:p>
+            <w:pPr>
+              <w:spacing w:line="360" w:lineRule="auto"/>
+              <w:jc w:val="both"/>
+              <w:rPr>
+                <w:b/>
+                <w:sz w:val="16"/>
+                <w:szCs w:val="16"/>
+              </w:rPr>
+            </w:pPr>
+          </w:p>
+        </w:tc>
+        <w:tc>
+          <w:tcPr>
+            <w:tcW w:w="515" w:type="dxa"/>
+          </w:tcPr>
+          <w:p>
+            <w:pPr>
+              <w:spacing w:line="360" w:lineRule="auto"/>
+              <w:jc w:val="both"/>
+              <w:rPr>
+                <w:b/>
+                <w:sz w:val="16"/>
+                <w:szCs w:val="16"/>
+              </w:rPr>
+            </w:pPr>
+          </w:p>
+        </w:tc>
+        <w:tc>
+          <w:tcPr>
+            <w:tcW w:w="519" w:type="dxa"/>
+          </w:tcPr>
+          <w:p>
+            <w:pPr>
+              <w:spacing w:line="360" w:lineRule="auto"/>
+              <w:jc w:val="both"/>
+              <w:rPr>
+                <w:b/>
+                <w:sz w:val="16"/>
+                <w:szCs w:val="16"/>
+              </w:rPr>
+            </w:pPr>
+          </w:p>
+        </w:tc>
+        <w:tc>
+          <w:tcPr>
+            <w:tcW w:w="516" w:type="dxa"/>
+          </w:tcPr>
+          <w:p>
+            <w:pPr>
+              <w:spacing w:line="360" w:lineRule="auto"/>
+              <w:jc w:val="both"/>
+              <w:rPr>
+                <w:b/>
+                <w:sz w:val="16"/>
+                <w:szCs w:val="16"/>
+              </w:rPr>
+            </w:pPr>
+          </w:p>
+        </w:tc>
+        <w:tc>
+          <w:tcPr>
+            <w:tcW w:w="516" w:type="dxa"/>
+          </w:tcPr>
+          <w:p>
+            <w:pPr>
+              <w:spacing w:line="360" w:lineRule="auto"/>
+              <w:jc w:val="both"/>
+              <w:rPr>
+                <w:b/>
+                <w:sz w:val="16"/>
+                <w:szCs w:val="16"/>
+              </w:rPr>
+            </w:pPr>
+          </w:p>
+        </w:tc>
+        <w:tc>
+          <w:tcPr>
+            <w:tcW w:w="516" w:type="dxa"/>
+          </w:tcPr>
+          <w:p>
+            <w:pPr>
+              <w:spacing w:line="360" w:lineRule="auto"/>
+              <w:jc w:val="both"/>
+              <w:rPr>
+                <w:b/>
+                <w:sz w:val="16"/>
+                <w:szCs w:val="16"/>
+              </w:rPr>
+            </w:pPr>
+          </w:p>
+        </w:tc>
+        <w:tc>
+          <w:tcPr>
+            <w:tcW w:w="516" w:type="dxa"/>
+          </w:tcPr>
+          <w:p>
+            <w:pPr>
+              <w:spacing w:line="360" w:lineRule="auto"/>
+              <w:jc w:val="both"/>
+              <w:rPr>
+                <w:b/>
+                <w:sz w:val="16"/>
+                <w:szCs w:val="16"/>
+              </w:rPr>
+            </w:pPr>
+          </w:p>
+        </w:tc>
+        <w:tc>
+          <w:tcPr>
+            <w:tcW w:w="516" w:type="dxa"/>
+          </w:tcPr>
+          <w:p>
+            <w:pPr>
+              <w:spacing w:line="360" w:lineRule="auto"/>
+              <w:jc w:val="both"/>
+              <w:rPr>
+                <w:b/>
+                <w:sz w:val="16"/>
+                <w:szCs w:val="16"/>
+              </w:rPr>
+            </w:pPr>
+            <w:r>
+              <w:rPr>
+                <w:b/>
+                <w:sz w:val="20"/>
+                <w:szCs w:val="20"/>
+              </w:rPr>
+              <w:t>X</w:t>
+            </w:r>
+          </w:p>
+        </w:tc>
+        <w:tc>
+          <w:tcPr>
+            <w:tcW w:w="518" w:type="dxa"/>
+          </w:tcPr>
+          <w:p>
+            <w:pPr>
+              <w:spacing w:line="360" w:lineRule="auto"/>
+              <w:jc w:val="both"/>
+              <w:rPr>
+                <w:b/>
+                <w:sz w:val="16"/>
+                <w:szCs w:val="16"/>
+              </w:rPr>
+            </w:pPr>
+            <w:r>
+              <w:rPr>
+                <w:b/>
+                <w:sz w:val="20"/>
+                <w:szCs w:val="20"/>
+              </w:rPr>
+              <w:t>X</w:t>
+            </w:r>
+          </w:p>
+        </w:tc>
+        <w:tc>
+          <w:tcPr>
+            <w:tcW w:w="518" w:type="dxa"/>
+          </w:tcPr>
+          <w:p>
+            <w:pPr>
+              <w:spacing w:line="360" w:lineRule="auto"/>
+              <w:jc w:val="both"/>
+              <w:rPr>
+                <w:b/>
+                <w:sz w:val="16"/>
+                <w:szCs w:val="16"/>
+              </w:rPr>
+            </w:pPr>
+            <w:r>
+              <w:rPr>
+                <w:b/>
+                <w:sz w:val="20"/>
+                <w:szCs w:val="20"/>
+              </w:rPr>
+              <w:t>X</w:t>
+            </w:r>
+          </w:p>
+        </w:tc>
+        <w:tc>
+          <w:tcPr>
+            <w:tcW w:w="518" w:type="dxa"/>
+          </w:tcPr>
+          <w:p>
+            <w:pPr>
+              <w:spacing w:line="360" w:lineRule="auto"/>
+              <w:jc w:val="both"/>
+              <w:rPr>
+                <w:b/>
+                <w:sz w:val="16"/>
+                <w:szCs w:val="16"/>
+              </w:rPr>
+            </w:pPr>
+          </w:p>
+        </w:tc>
+        <w:tc>
+          <w:tcPr>
+            <w:tcW w:w="520" w:type="dxa"/>
+          </w:tcPr>
+          <w:p>
+            <w:pPr>
+              <w:spacing w:line="360" w:lineRule="auto"/>
+              <w:jc w:val="both"/>
+              <w:rPr>
+                <w:b/>
+                <w:sz w:val="16"/>
+                <w:szCs w:val="16"/>
+              </w:rPr>
+            </w:pPr>
+          </w:p>
+        </w:tc>
+        <w:tc>
+          <w:tcPr>
+            <w:tcW w:w="520" w:type="dxa"/>
+          </w:tcPr>
+          <w:p>
+            <w:pPr>
+              <w:spacing w:line="360" w:lineRule="auto"/>
+              <w:jc w:val="both"/>
+              <w:rPr>
+                <w:b/>
+                <w:sz w:val="16"/>
+                <w:szCs w:val="16"/>
+              </w:rPr>
+            </w:pPr>
+          </w:p>
+        </w:tc>
+        <w:tc>
+          <w:tcPr>
+            <w:tcW w:w="520" w:type="dxa"/>
+          </w:tcPr>
+          <w:p>
+            <w:pPr>
+              <w:spacing w:line="360" w:lineRule="auto"/>
+              <w:jc w:val="both"/>
+              <w:rPr>
+                <w:b/>
+                <w:sz w:val="16"/>
+                <w:szCs w:val="16"/>
+              </w:rPr>
+            </w:pPr>
+          </w:p>
+        </w:tc>
+        <w:tc>
+          <w:tcPr>
+            <w:tcW w:w="520" w:type="dxa"/>
+            <w:gridSpan w:val="2"/>
+          </w:tcPr>
+          <w:p>
+            <w:pPr>
+              <w:spacing w:line="360" w:lineRule="auto"/>
+              <w:jc w:val="both"/>
+              <w:rPr>
+                <w:b/>
+                <w:sz w:val="16"/>
+                <w:szCs w:val="16"/>
+              </w:rPr>
+            </w:pPr>
+          </w:p>
+        </w:tc>
+        <w:tc>
+          <w:tcPr>
+            <w:tcW w:w="520" w:type="dxa"/>
+          </w:tcPr>
+          <w:p>
+            <w:pPr>
+              <w:spacing w:line="360" w:lineRule="auto"/>
+              <w:jc w:val="both"/>
+              <w:rPr>
+                <w:b/>
+                <w:sz w:val="16"/>
+                <w:szCs w:val="16"/>
+              </w:rPr>
+            </w:pPr>
+          </w:p>
+        </w:tc>
+        <w:tc>
+          <w:tcPr>
+            <w:tcW w:w="520" w:type="dxa"/>
+          </w:tcPr>
+          <w:p>
+            <w:pPr>
+              <w:spacing w:line="360" w:lineRule="auto"/>
+              <w:jc w:val="both"/>
+              <w:rPr>
+                <w:b/>
+                <w:sz w:val="16"/>
+                <w:szCs w:val="16"/>
+              </w:rPr>
+            </w:pPr>
+          </w:p>
+        </w:tc>
+      </w:tr>
+      <w:tr>
+        <w:trPr>
+          <w:gridAfter w:val="1"/>
+          <w:wAfter w:w="10" w:type="dxa"/>
+          <w:trHeight w:val="294"/>
+        </w:trPr>
+        <w:tc>
+          <w:tcPr>
+            <w:tcW w:w="1463" w:type="dxa"/>
+          </w:tcPr>
+          <w:p>
+            <w:pPr>
+              <w:spacing w:line="360" w:lineRule="auto"/>
+              <w:jc w:val="center"/>
+            </w:pPr>
+            <w:r>
+              <w:t>Desarrollo Sprint 3 – Integración de agentes IA</w:t>
+            </w:r>
+          </w:p>
+        </w:tc>
+        <w:tc>
+          <w:tcPr>
+            <w:tcW w:w="527" w:type="dxa"/>
+          </w:tcPr>
+          <w:p>
+            <w:pPr>
+              <w:spacing w:line="360" w:lineRule="auto"/>
+              <w:jc w:val="both"/>
+              <w:rPr>
+                <w:b/>
+                <w:sz w:val="16"/>
+                <w:szCs w:val="16"/>
+              </w:rPr>
+            </w:pPr>
+          </w:p>
+        </w:tc>
+        <w:tc>
+          <w:tcPr>
+            <w:tcW w:w="514" w:type="dxa"/>
+          </w:tcPr>
+          <w:p>
+            <w:pPr>
+              <w:spacing w:line="360" w:lineRule="auto"/>
+              <w:jc w:val="both"/>
+              <w:rPr>
+                <w:b/>
+                <w:sz w:val="16"/>
+                <w:szCs w:val="16"/>
+              </w:rPr>
+            </w:pPr>
+          </w:p>
+        </w:tc>
+        <w:tc>
+          <w:tcPr>
+            <w:tcW w:w="515" w:type="dxa"/>
+          </w:tcPr>
+          <w:p>
+            <w:pPr>
+              <w:spacing w:line="360" w:lineRule="auto"/>
+              <w:jc w:val="both"/>
+              <w:rPr>
+                <w:b/>
+                <w:sz w:val="16"/>
+                <w:szCs w:val="16"/>
+              </w:rPr>
+            </w:pPr>
+          </w:p>
+        </w:tc>
+        <w:tc>
+          <w:tcPr>
+            <w:tcW w:w="519" w:type="dxa"/>
+          </w:tcPr>
+          <w:p>
+            <w:pPr>
+              <w:spacing w:line="360" w:lineRule="auto"/>
+              <w:jc w:val="both"/>
+              <w:rPr>
+                <w:b/>
+                <w:sz w:val="16"/>
+                <w:szCs w:val="16"/>
+              </w:rPr>
+            </w:pPr>
+          </w:p>
+        </w:tc>
+        <w:tc>
+          <w:tcPr>
+            <w:tcW w:w="516" w:type="dxa"/>
+          </w:tcPr>
+          <w:p>
+            <w:pPr>
+              <w:spacing w:line="360" w:lineRule="auto"/>
+              <w:jc w:val="both"/>
+              <w:rPr>
+                <w:b/>
+                <w:sz w:val="16"/>
+                <w:szCs w:val="16"/>
+              </w:rPr>
+            </w:pPr>
+          </w:p>
+        </w:tc>
+        <w:tc>
+          <w:tcPr>
+            <w:tcW w:w="516" w:type="dxa"/>
+          </w:tcPr>
+          <w:p>
+            <w:pPr>
+              <w:spacing w:line="360" w:lineRule="auto"/>
+              <w:jc w:val="both"/>
+              <w:rPr>
+                <w:b/>
+                <w:sz w:val="16"/>
+                <w:szCs w:val="16"/>
+              </w:rPr>
+            </w:pPr>
+          </w:p>
+        </w:tc>
+        <w:tc>
+          <w:tcPr>
+            <w:tcW w:w="516" w:type="dxa"/>
+          </w:tcPr>
+          <w:p>
+            <w:pPr>
+              <w:spacing w:line="360" w:lineRule="auto"/>
+              <w:jc w:val="both"/>
+              <w:rPr>
+                <w:b/>
+                <w:sz w:val="16"/>
+                <w:szCs w:val="16"/>
+              </w:rPr>
+            </w:pPr>
+          </w:p>
+        </w:tc>
+        <w:tc>
+          <w:tcPr>
+            <w:tcW w:w="516" w:type="dxa"/>
+          </w:tcPr>
+          <w:p>
+            <w:pPr>
+              <w:spacing w:line="360" w:lineRule="auto"/>
+              <w:jc w:val="both"/>
+              <w:rPr>
+                <w:b/>
+                <w:sz w:val="16"/>
+                <w:szCs w:val="16"/>
+              </w:rPr>
+            </w:pPr>
+          </w:p>
+        </w:tc>
+        <w:tc>
+          <w:tcPr>
+            <w:tcW w:w="516" w:type="dxa"/>
+          </w:tcPr>
+          <w:p>
+            <w:pPr>
+              <w:spacing w:line="360" w:lineRule="auto"/>
+              <w:jc w:val="both"/>
+              <w:rPr>
+                <w:b/>
+                <w:sz w:val="16"/>
+                <w:szCs w:val="16"/>
+              </w:rPr>
+            </w:pPr>
+          </w:p>
+        </w:tc>
+        <w:tc>
+          <w:tcPr>
+            <w:tcW w:w="518" w:type="dxa"/>
+          </w:tcPr>
+          <w:p>
+            <w:pPr>
+              <w:spacing w:line="360" w:lineRule="auto"/>
+              <w:jc w:val="both"/>
+              <w:rPr>
+                <w:b/>
+                <w:sz w:val="16"/>
+                <w:szCs w:val="16"/>
+              </w:rPr>
+            </w:pPr>
+          </w:p>
+        </w:tc>
+        <w:tc>
+          <w:tcPr>
+            <w:tcW w:w="518" w:type="dxa"/>
+          </w:tcPr>
+          <w:p>
+            <w:pPr>
+              <w:spacing w:line="360" w:lineRule="auto"/>
+              <w:jc w:val="both"/>
+              <w:rPr>
+                <w:b/>
+                <w:sz w:val="16"/>
+                <w:szCs w:val="16"/>
+              </w:rPr>
+            </w:pPr>
+          </w:p>
+        </w:tc>
+        <w:tc>
+          <w:tcPr>
+            <w:tcW w:w="518" w:type="dxa"/>
+          </w:tcPr>
+          <w:p>
+            <w:pPr>
+              <w:spacing w:line="360" w:lineRule="auto"/>
+              <w:jc w:val="both"/>
+              <w:rPr>
+                <w:b/>
+                <w:sz w:val="16"/>
+                <w:szCs w:val="16"/>
+              </w:rPr>
+            </w:pPr>
+            <w:r>
+              <w:rPr>
+                <w:b/>
+                <w:sz w:val="20"/>
+                <w:szCs w:val="20"/>
+              </w:rPr>
+              <w:t>X</w:t>
+            </w:r>
+          </w:p>
+        </w:tc>
+        <w:tc>
+          <w:tcPr>
+            <w:tcW w:w="520" w:type="dxa"/>
+          </w:tcPr>
+          <w:p>
+            <w:pPr>
+              <w:spacing w:line="360" w:lineRule="auto"/>
+              <w:jc w:val="both"/>
+              <w:rPr>
+                <w:b/>
+                <w:sz w:val="16"/>
+                <w:szCs w:val="16"/>
+              </w:rPr>
+            </w:pPr>
+            <w:r>
+              <w:rPr>
+                <w:b/>
+                <w:sz w:val="20"/>
+                <w:szCs w:val="20"/>
+              </w:rPr>
+              <w:t>X</w:t>
+            </w:r>
+          </w:p>
+        </w:tc>
+        <w:tc>
+          <w:tcPr>
+            <w:tcW w:w="520" w:type="dxa"/>
+          </w:tcPr>
+          <w:p>
+            <w:pPr>
+              <w:spacing w:line="360" w:lineRule="auto"/>
+              <w:jc w:val="both"/>
+              <w:rPr>
+                <w:b/>
+                <w:sz w:val="16"/>
+                <w:szCs w:val="16"/>
+              </w:rPr>
+            </w:pPr>
+            <w:r>
+              <w:rPr>
+                <w:b/>
+                <w:sz w:val="20"/>
+                <w:szCs w:val="20"/>
+              </w:rPr>
+              <w:t>X</w:t>
+            </w:r>
+          </w:p>
+        </w:tc>
+        <w:tc>
+          <w:tcPr>
+            <w:tcW w:w="520" w:type="dxa"/>
+          </w:tcPr>
+          <w:p>
+            <w:pPr>
+              <w:spacing w:line="360" w:lineRule="auto"/>
+              <w:jc w:val="both"/>
+              <w:rPr>
+                <w:b/>
+                <w:sz w:val="16"/>
+                <w:szCs w:val="16"/>
+              </w:rPr>
+            </w:pPr>
+          </w:p>
+        </w:tc>
+        <w:tc>
+          <w:tcPr>
+            <w:tcW w:w="520" w:type="dxa"/>
+            <w:gridSpan w:val="2"/>
+          </w:tcPr>
+          <w:p>
+            <w:pPr>
+              <w:spacing w:line="360" w:lineRule="auto"/>
+              <w:jc w:val="both"/>
+              <w:rPr>
+                <w:b/>
+                <w:sz w:val="16"/>
+                <w:szCs w:val="16"/>
+              </w:rPr>
+            </w:pPr>
+          </w:p>
+        </w:tc>
+        <w:tc>
+          <w:tcPr>
+            <w:tcW w:w="520" w:type="dxa"/>
+          </w:tcPr>
+          <w:p>
+            <w:pPr>
+              <w:spacing w:line="360" w:lineRule="auto"/>
+              <w:jc w:val="both"/>
+              <w:rPr>
+                <w:b/>
+                <w:sz w:val="16"/>
+                <w:szCs w:val="16"/>
+              </w:rPr>
+            </w:pPr>
+          </w:p>
+        </w:tc>
+        <w:tc>
+          <w:tcPr>
+            <w:tcW w:w="520" w:type="dxa"/>
+          </w:tcPr>
+          <w:p>
+            <w:pPr>
+              <w:spacing w:line="360" w:lineRule="auto"/>
+              <w:jc w:val="both"/>
+              <w:rPr>
+                <w:b/>
+                <w:sz w:val="16"/>
+                <w:szCs w:val="16"/>
+              </w:rPr>
+            </w:pPr>
+          </w:p>
+        </w:tc>
+      </w:tr>
+      <w:tr>
+        <w:trPr>
+          <w:gridAfter w:val="1"/>
+          <w:wAfter w:w="10" w:type="dxa"/>
+          <w:trHeight w:val="294"/>
+        </w:trPr>
+        <w:tc>
+          <w:tcPr>
+            <w:tcW w:w="1463" w:type="dxa"/>
+          </w:tcPr>
+          <w:p>
+            <w:pPr>
+              <w:spacing w:line="360" w:lineRule="auto"/>
+              <w:jc w:val="center"/>
+            </w:pPr>
+            <w:r>
+              <w:t>Pruebas técnicas y de usuario</w:t>
+            </w:r>
+          </w:p>
+        </w:tc>
+        <w:tc>
+          <w:tcPr>
+            <w:tcW w:w="527" w:type="dxa"/>
+          </w:tcPr>
+          <w:p>
+            <w:pPr>
+              <w:spacing w:line="360" w:lineRule="auto"/>
+              <w:jc w:val="both"/>
+              <w:rPr>
+                <w:b/>
+                <w:sz w:val="16"/>
+                <w:szCs w:val="16"/>
+              </w:rPr>
+            </w:pPr>
+          </w:p>
+        </w:tc>
+        <w:tc>
+          <w:tcPr>
+            <w:tcW w:w="514" w:type="dxa"/>
+          </w:tcPr>
+          <w:p>
+            <w:pPr>
+              <w:spacing w:line="360" w:lineRule="auto"/>
+              <w:jc w:val="both"/>
+              <w:rPr>
+                <w:b/>
+                <w:sz w:val="16"/>
+                <w:szCs w:val="16"/>
+              </w:rPr>
+            </w:pPr>
+          </w:p>
+        </w:tc>
+        <w:tc>
+          <w:tcPr>
+            <w:tcW w:w="515" w:type="dxa"/>
+          </w:tcPr>
+          <w:p>
+            <w:pPr>
+              <w:spacing w:line="360" w:lineRule="auto"/>
+              <w:jc w:val="both"/>
+              <w:rPr>
+                <w:b/>
+                <w:sz w:val="16"/>
+                <w:szCs w:val="16"/>
+              </w:rPr>
+            </w:pPr>
+          </w:p>
+        </w:tc>
+        <w:tc>
+          <w:tcPr>
+            <w:tcW w:w="519" w:type="dxa"/>
+          </w:tcPr>
+          <w:p>
+            <w:pPr>
+              <w:spacing w:line="360" w:lineRule="auto"/>
+              <w:jc w:val="both"/>
+              <w:rPr>
+                <w:b/>
+                <w:sz w:val="16"/>
+                <w:szCs w:val="16"/>
+              </w:rPr>
+            </w:pPr>
+          </w:p>
+        </w:tc>
+        <w:tc>
+          <w:tcPr>
+            <w:tcW w:w="516" w:type="dxa"/>
+          </w:tcPr>
+          <w:p>
+            <w:pPr>
+              <w:spacing w:line="360" w:lineRule="auto"/>
+              <w:jc w:val="both"/>
+              <w:rPr>
+                <w:b/>
+                <w:sz w:val="16"/>
+                <w:szCs w:val="16"/>
+              </w:rPr>
+            </w:pPr>
+          </w:p>
+        </w:tc>
+        <w:tc>
+          <w:tcPr>
+            <w:tcW w:w="516" w:type="dxa"/>
+          </w:tcPr>
+          <w:p>
+            <w:pPr>
+              <w:spacing w:line="360" w:lineRule="auto"/>
+              <w:jc w:val="both"/>
+              <w:rPr>
+                <w:b/>
+                <w:sz w:val="16"/>
+                <w:szCs w:val="16"/>
+              </w:rPr>
+            </w:pPr>
+          </w:p>
+        </w:tc>
+        <w:tc>
+          <w:tcPr>
+            <w:tcW w:w="516" w:type="dxa"/>
+          </w:tcPr>
+          <w:p>
+            <w:pPr>
+              <w:spacing w:line="360" w:lineRule="auto"/>
+              <w:jc w:val="both"/>
+              <w:rPr>
+                <w:b/>
+                <w:sz w:val="16"/>
+                <w:szCs w:val="16"/>
+              </w:rPr>
+            </w:pPr>
+          </w:p>
+        </w:tc>
+        <w:tc>
+          <w:tcPr>
+            <w:tcW w:w="516" w:type="dxa"/>
+          </w:tcPr>
+          <w:p>
+            <w:pPr>
+              <w:spacing w:line="360" w:lineRule="auto"/>
+              <w:jc w:val="both"/>
+              <w:rPr>
+                <w:b/>
+                <w:sz w:val="16"/>
+                <w:szCs w:val="16"/>
+              </w:rPr>
+            </w:pPr>
+          </w:p>
+        </w:tc>
+        <w:tc>
+          <w:tcPr>
+            <w:tcW w:w="516" w:type="dxa"/>
+          </w:tcPr>
+          <w:p>
+            <w:pPr>
+              <w:spacing w:line="360" w:lineRule="auto"/>
+              <w:jc w:val="both"/>
+              <w:rPr>
+                <w:b/>
+                <w:sz w:val="16"/>
+                <w:szCs w:val="16"/>
+              </w:rPr>
+            </w:pPr>
+          </w:p>
+        </w:tc>
+        <w:tc>
+          <w:tcPr>
+            <w:tcW w:w="518" w:type="dxa"/>
+          </w:tcPr>
+          <w:p>
+            <w:pPr>
+              <w:spacing w:line="360" w:lineRule="auto"/>
+              <w:jc w:val="both"/>
+              <w:rPr>
+                <w:b/>
+                <w:sz w:val="16"/>
+                <w:szCs w:val="16"/>
+              </w:rPr>
+            </w:pPr>
+          </w:p>
+        </w:tc>
+        <w:tc>
+          <w:tcPr>
+            <w:tcW w:w="518" w:type="dxa"/>
+          </w:tcPr>
+          <w:p>
+            <w:pPr>
+              <w:spacing w:line="360" w:lineRule="auto"/>
+              <w:jc w:val="both"/>
+              <w:rPr>
+                <w:b/>
+                <w:sz w:val="16"/>
+                <w:szCs w:val="16"/>
+              </w:rPr>
+            </w:pPr>
+          </w:p>
+        </w:tc>
+        <w:tc>
+          <w:tcPr>
+            <w:tcW w:w="518" w:type="dxa"/>
+          </w:tcPr>
+          <w:p>
+            <w:pPr>
+              <w:spacing w:line="360" w:lineRule="auto"/>
+              <w:jc w:val="both"/>
+              <w:rPr>
+                <w:b/>
+                <w:sz w:val="16"/>
+                <w:szCs w:val="16"/>
+              </w:rPr>
+            </w:pPr>
+          </w:p>
+        </w:tc>
+        <w:tc>
+          <w:tcPr>
+            <w:tcW w:w="520" w:type="dxa"/>
+          </w:tcPr>
+          <w:p>
+            <w:pPr>
+              <w:spacing w:line="360" w:lineRule="auto"/>
+              <w:jc w:val="both"/>
+              <w:rPr>
+                <w:b/>
+                <w:sz w:val="16"/>
+                <w:szCs w:val="16"/>
+              </w:rPr>
+            </w:pPr>
+          </w:p>
+        </w:tc>
+        <w:tc>
+          <w:tcPr>
+            <w:tcW w:w="520" w:type="dxa"/>
+          </w:tcPr>
+          <w:p>
+            <w:pPr>
+              <w:spacing w:line="360" w:lineRule="auto"/>
+              <w:jc w:val="both"/>
+              <w:rPr>
+                <w:b/>
+                <w:sz w:val="16"/>
+                <w:szCs w:val="16"/>
+              </w:rPr>
+            </w:pPr>
+          </w:p>
+        </w:tc>
+        <w:tc>
+          <w:tcPr>
+            <w:tcW w:w="520" w:type="dxa"/>
+          </w:tcPr>
+          <w:p>
+            <w:pPr>
+              <w:spacing w:line="360" w:lineRule="auto"/>
+              <w:jc w:val="both"/>
+              <w:rPr>
+                <w:b/>
+                <w:sz w:val="16"/>
+                <w:szCs w:val="16"/>
+              </w:rPr>
+            </w:pPr>
+            <w:r>
+              <w:rPr>
+                <w:b/>
+                <w:sz w:val="20"/>
+                <w:szCs w:val="20"/>
+              </w:rPr>
+              <w:t>X</w:t>
+            </w:r>
+          </w:p>
+        </w:tc>
+        <w:tc>
+          <w:tcPr>
+            <w:tcW w:w="520" w:type="dxa"/>
+            <w:gridSpan w:val="2"/>
+          </w:tcPr>
+          <w:p>
+            <w:pPr>
+              <w:spacing w:line="360" w:lineRule="auto"/>
+              <w:jc w:val="both"/>
+              <w:rPr>
+                <w:b/>
+                <w:sz w:val="16"/>
+                <w:szCs w:val="16"/>
+              </w:rPr>
+            </w:pPr>
+            <w:r>
+              <w:rPr>
+                <w:b/>
+                <w:sz w:val="20"/>
+                <w:szCs w:val="20"/>
+              </w:rPr>
+              <w:t>X</w:t>
+            </w:r>
+          </w:p>
+        </w:tc>
+        <w:tc>
+          <w:tcPr>
+            <w:tcW w:w="520" w:type="dxa"/>
+          </w:tcPr>
+          <w:p>
+            <w:pPr>
+              <w:spacing w:line="360" w:lineRule="auto"/>
+              <w:jc w:val="both"/>
+              <w:rPr>
+                <w:b/>
+                <w:sz w:val="16"/>
+                <w:szCs w:val="16"/>
+              </w:rPr>
+            </w:pPr>
+          </w:p>
+        </w:tc>
+        <w:tc>
+          <w:tcPr>
+            <w:tcW w:w="520" w:type="dxa"/>
+          </w:tcPr>
+          <w:p>
+            <w:pPr>
+              <w:spacing w:line="360" w:lineRule="auto"/>
+              <w:jc w:val="both"/>
+              <w:rPr>
+                <w:b/>
+                <w:sz w:val="16"/>
+                <w:szCs w:val="16"/>
+              </w:rPr>
+            </w:pPr>
+          </w:p>
+        </w:tc>
+      </w:tr>
+      <w:tr>
+        <w:trPr>
+          <w:gridAfter w:val="1"/>
+          <w:wAfter w:w="10" w:type="dxa"/>
+          <w:trHeight w:val="294"/>
+        </w:trPr>
+        <w:tc>
+          <w:tcPr>
+            <w:tcW w:w="1463" w:type="dxa"/>
+          </w:tcPr>
+          <w:p>
+            <w:pPr>
+              <w:spacing w:line="360" w:lineRule="auto"/>
+              <w:jc w:val="center"/>
+            </w:pPr>
+            <w:r>
+              <w:t>Documentación y cierre del proyecto</w:t>
+            </w:r>
+          </w:p>
+        </w:tc>
+        <w:tc>
+          <w:tcPr>
+            <w:tcW w:w="527" w:type="dxa"/>
+          </w:tcPr>
+          <w:p>
+            <w:pPr>
+              <w:spacing w:line="360" w:lineRule="auto"/>
+              <w:jc w:val="both"/>
+              <w:rPr>
+                <w:b/>
+                <w:sz w:val="16"/>
+                <w:szCs w:val="16"/>
+              </w:rPr>
+            </w:pPr>
+          </w:p>
+        </w:tc>
+        <w:tc>
+          <w:tcPr>
+            <w:tcW w:w="514" w:type="dxa"/>
+          </w:tcPr>
+          <w:p>
+            <w:pPr>
+              <w:spacing w:line="360" w:lineRule="auto"/>
+              <w:jc w:val="both"/>
+              <w:rPr>
+                <w:b/>
+                <w:sz w:val="16"/>
+                <w:szCs w:val="16"/>
+              </w:rPr>
+            </w:pPr>
+          </w:p>
+        </w:tc>
+        <w:tc>
+          <w:tcPr>
+            <w:tcW w:w="515" w:type="dxa"/>
+          </w:tcPr>
+          <w:p>
+            <w:pPr>
+              <w:spacing w:line="360" w:lineRule="auto"/>
+              <w:jc w:val="both"/>
+              <w:rPr>
+                <w:b/>
+                <w:sz w:val="16"/>
+                <w:szCs w:val="16"/>
+              </w:rPr>
+            </w:pPr>
+          </w:p>
+        </w:tc>
+        <w:tc>
+          <w:tcPr>
+            <w:tcW w:w="519" w:type="dxa"/>
+          </w:tcPr>
+          <w:p>
+            <w:pPr>
+              <w:spacing w:line="360" w:lineRule="auto"/>
+              <w:jc w:val="both"/>
+              <w:rPr>
+                <w:b/>
+                <w:sz w:val="16"/>
+                <w:szCs w:val="16"/>
+              </w:rPr>
+            </w:pPr>
+          </w:p>
+        </w:tc>
+        <w:tc>
+          <w:tcPr>
+            <w:tcW w:w="516" w:type="dxa"/>
+          </w:tcPr>
+          <w:p>
+            <w:pPr>
+              <w:spacing w:line="360" w:lineRule="auto"/>
+              <w:jc w:val="both"/>
+              <w:rPr>
+                <w:b/>
+                <w:sz w:val="16"/>
+                <w:szCs w:val="16"/>
+              </w:rPr>
+            </w:pPr>
+          </w:p>
+        </w:tc>
+        <w:tc>
+          <w:tcPr>
+            <w:tcW w:w="516" w:type="dxa"/>
+          </w:tcPr>
+          <w:p>
+            <w:pPr>
+              <w:spacing w:line="360" w:lineRule="auto"/>
+              <w:jc w:val="both"/>
+              <w:rPr>
+                <w:b/>
+                <w:sz w:val="16"/>
+                <w:szCs w:val="16"/>
+              </w:rPr>
+            </w:pPr>
+          </w:p>
+        </w:tc>
+        <w:tc>
+          <w:tcPr>
+            <w:tcW w:w="516" w:type="dxa"/>
+          </w:tcPr>
+          <w:p>
+            <w:pPr>
+              <w:spacing w:line="360" w:lineRule="auto"/>
+              <w:jc w:val="both"/>
+              <w:rPr>
+                <w:b/>
+                <w:sz w:val="16"/>
+                <w:szCs w:val="16"/>
+              </w:rPr>
+            </w:pPr>
+          </w:p>
+        </w:tc>
+        <w:tc>
+          <w:tcPr>
+            <w:tcW w:w="516" w:type="dxa"/>
+          </w:tcPr>
+          <w:p>
+            <w:pPr>
+              <w:spacing w:line="360" w:lineRule="auto"/>
+              <w:jc w:val="both"/>
+              <w:rPr>
+                <w:b/>
+                <w:sz w:val="16"/>
+                <w:szCs w:val="16"/>
+              </w:rPr>
+            </w:pPr>
+          </w:p>
+        </w:tc>
+        <w:tc>
+          <w:tcPr>
+            <w:tcW w:w="516" w:type="dxa"/>
+          </w:tcPr>
+          <w:p>
+            <w:pPr>
+              <w:spacing w:line="360" w:lineRule="auto"/>
+              <w:jc w:val="both"/>
+              <w:rPr>
+                <w:b/>
+                <w:sz w:val="16"/>
+                <w:szCs w:val="16"/>
+              </w:rPr>
+            </w:pPr>
+          </w:p>
+        </w:tc>
+        <w:tc>
+          <w:tcPr>
+            <w:tcW w:w="518" w:type="dxa"/>
+          </w:tcPr>
+          <w:p>
+            <w:pPr>
+              <w:spacing w:line="360" w:lineRule="auto"/>
+              <w:jc w:val="both"/>
+              <w:rPr>
+                <w:b/>
+                <w:sz w:val="16"/>
+                <w:szCs w:val="16"/>
+              </w:rPr>
+            </w:pPr>
+          </w:p>
+        </w:tc>
+        <w:tc>
+          <w:tcPr>
+            <w:tcW w:w="518" w:type="dxa"/>
+          </w:tcPr>
+          <w:p>
+            <w:pPr>
+              <w:spacing w:line="360" w:lineRule="auto"/>
+              <w:jc w:val="both"/>
+              <w:rPr>
+                <w:b/>
+                <w:sz w:val="16"/>
+                <w:szCs w:val="16"/>
+              </w:rPr>
+            </w:pPr>
+          </w:p>
+        </w:tc>
+        <w:tc>
+          <w:tcPr>
+            <w:tcW w:w="518" w:type="dxa"/>
+          </w:tcPr>
+          <w:p>
+            <w:pPr>
+              <w:spacing w:line="360" w:lineRule="auto"/>
+              <w:jc w:val="both"/>
+              <w:rPr>
+                <w:b/>
+                <w:sz w:val="16"/>
+                <w:szCs w:val="16"/>
+              </w:rPr>
+            </w:pPr>
+          </w:p>
+        </w:tc>
+        <w:tc>
+          <w:tcPr>
+            <w:tcW w:w="520" w:type="dxa"/>
+          </w:tcPr>
+          <w:p>
+            <w:pPr>
+              <w:spacing w:line="360" w:lineRule="auto"/>
+              <w:jc w:val="both"/>
+              <w:rPr>
+                <w:b/>
+                <w:sz w:val="16"/>
+                <w:szCs w:val="16"/>
+              </w:rPr>
+            </w:pPr>
+          </w:p>
+        </w:tc>
+        <w:tc>
+          <w:tcPr>
+            <w:tcW w:w="520" w:type="dxa"/>
+          </w:tcPr>
+          <w:p>
+            <w:pPr>
+              <w:spacing w:line="360" w:lineRule="auto"/>
+              <w:jc w:val="both"/>
+              <w:rPr>
+                <w:b/>
+                <w:sz w:val="16"/>
+                <w:szCs w:val="16"/>
+              </w:rPr>
+            </w:pPr>
+          </w:p>
+        </w:tc>
+        <w:tc>
+          <w:tcPr>
+            <w:tcW w:w="520" w:type="dxa"/>
+          </w:tcPr>
+          <w:p>
+            <w:pPr>
+              <w:spacing w:line="360" w:lineRule="auto"/>
+              <w:jc w:val="both"/>
+              <w:rPr>
+                <w:b/>
+                <w:sz w:val="16"/>
+                <w:szCs w:val="16"/>
+              </w:rPr>
+            </w:pPr>
+          </w:p>
+        </w:tc>
+        <w:tc>
+          <w:tcPr>
+            <w:tcW w:w="520" w:type="dxa"/>
+            <w:gridSpan w:val="2"/>
+          </w:tcPr>
+          <w:p>
+            <w:pPr>
+              <w:spacing w:line="360" w:lineRule="auto"/>
+              <w:jc w:val="both"/>
+              <w:rPr>
+                <w:b/>
+                <w:sz w:val="16"/>
+                <w:szCs w:val="16"/>
+              </w:rPr>
+            </w:pPr>
+          </w:p>
+        </w:tc>
+        <w:tc>
+          <w:tcPr>
+            <w:tcW w:w="520" w:type="dxa"/>
+          </w:tcPr>
+          <w:p>
+            <w:pPr>
+              <w:spacing w:line="360" w:lineRule="auto"/>
+              <w:jc w:val="both"/>
+              <w:rPr>
+                <w:b/>
+                <w:sz w:val="16"/>
+                <w:szCs w:val="16"/>
+              </w:rPr>
+            </w:pPr>
+            <w:r>
+              <w:rPr>
+                <w:b/>
+                <w:sz w:val="20"/>
+                <w:szCs w:val="20"/>
+              </w:rPr>
+              <w:t>X</w:t>
+            </w:r>
+          </w:p>
+        </w:tc>
+        <w:tc>
+          <w:tcPr>
+            <w:tcW w:w="520" w:type="dxa"/>
+          </w:tcPr>
+          <w:p>
+            <w:pPr>
+              <w:spacing w:line="360" w:lineRule="auto"/>
+              <w:jc w:val="both"/>
+              <w:rPr>
+                <w:b/>
+                <w:sz w:val="16"/>
+                <w:szCs w:val="16"/>
+              </w:rPr>
+            </w:pPr>
+            <w:r>
+              <w:rPr>
+                <w:b/>
+                <w:sz w:val="20"/>
+                <w:szCs w:val="20"/>
+              </w:rPr>
+              <w:t>X</w:t>
+            </w:r>
           </w:p>
         </w:tc>
       </w:tr>

</xml_diff>